<commit_message>
added new version of writeup
</commit_message>
<xml_diff>
--- a/Compsci coursework.docx
+++ b/Compsci coursework.docx
@@ -1,12 +1,12 @@
 
 <file path=word/document.xml><?xml version="1.0" encoding="utf-8"?>
-<w:document xmlns:wpc="http://schemas.microsoft.com/office/word/2010/wordprocessingCanvas" xmlns:cx="http://schemas.microsoft.com/office/drawing/2014/chartex" xmlns:cx1="http://schemas.microsoft.com/office/drawing/2015/9/8/chartex" xmlns:cx2="http://schemas.microsoft.com/office/drawing/2015/10/21/chartex" xmlns:cx3="http://schemas.microsoft.com/office/drawing/2016/5/9/chartex" xmlns:cx4="http://schemas.microsoft.com/office/drawing/2016/5/10/chartex" xmlns:cx5="http://schemas.microsoft.com/office/drawing/2016/5/11/chartex" xmlns:cx6="http://schemas.microsoft.com/office/drawing/2016/5/12/chartex" xmlns:cx7="http://schemas.microsoft.com/office/drawing/2016/5/13/chartex" xmlns:cx8="http://schemas.microsoft.com/office/drawing/2016/5/14/chartex" xmlns:mc="http://schemas.openxmlformats.org/markup-compatibility/2006" xmlns:aink="http://schemas.microsoft.com/office/drawing/2016/ink" xmlns:am3d="http://schemas.microsoft.com/office/drawing/2017/model3d" xmlns:o="urn:schemas-microsoft-com:office:office" xmlns:oel="http://schemas.microsoft.com/office/2019/extlst" xmlns:r="http://schemas.openxmlformats.org/officeDocument/2006/relationships" xmlns:m="http://schemas.openxmlformats.org/officeDocument/2006/math" xmlns:v="urn:schemas-microsoft-com:vml" xmlns:wp14="http://schemas.microsoft.com/office/word/2010/wordprocessingDrawing" xmlns:wp="http://schemas.openxmlformats.org/drawingml/2006/wordprocessingDrawing" xmlns:w10="urn:schemas-microsoft-com:office:word" xmlns:w="http://schemas.openxmlformats.org/wordprocessingml/2006/main" xmlns:w14="http://schemas.microsoft.com/office/word/2010/wordml" xmlns:w15="http://schemas.microsoft.com/office/word/2012/wordml" xmlns:w16cei="http://schemas.microsoft.com/office/word/2026/wordml/cei" xmlns:w16cex="http://schemas.microsoft.com/office/word/2018/wordml/cex" xmlns:w16cid="http://schemas.microsoft.com/office/word/2016/wordml/cid" xmlns:w16="http://schemas.microsoft.com/office/word/2018/wordml" xmlns:w16du="http://schemas.microsoft.com/office/word/2023/wordml/word16du" xmlns:w16sdtdh="http://schemas.microsoft.com/office/word/2020/wordml/sdtdatahash" xmlns:w16sdtfl="http://schemas.microsoft.com/office/word/2024/wordml/sdtformatlock" xmlns:w16se="http://schemas.microsoft.com/office/word/2015/wordml/symex" xmlns:wpg="http://schemas.microsoft.com/office/word/2010/wordprocessingGroup" xmlns:wpi="http://schemas.microsoft.com/office/word/2010/wordprocessingInk" xmlns:wne="http://schemas.microsoft.com/office/word/2006/wordml" xmlns:wps="http://schemas.microsoft.com/office/word/2010/wordprocessingShape" mc:Ignorable="w14 w15 w16se w16cid w16 w16cex w16sdtdh w16sdtfl w16du wp14">
+<w:document xmlns:wpc="http://schemas.microsoft.com/office/word/2010/wordprocessingCanvas" xmlns:cx="http://schemas.microsoft.com/office/drawing/2014/chartex" xmlns:cx1="http://schemas.microsoft.com/office/drawing/2015/9/8/chartex" xmlns:cx2="http://schemas.microsoft.com/office/drawing/2015/10/21/chartex" xmlns:cx3="http://schemas.microsoft.com/office/drawing/2016/5/9/chartex" xmlns:cx4="http://schemas.microsoft.com/office/drawing/2016/5/10/chartex" xmlns:cx5="http://schemas.microsoft.com/office/drawing/2016/5/11/chartex" xmlns:cx6="http://schemas.microsoft.com/office/drawing/2016/5/12/chartex" xmlns:cx7="http://schemas.microsoft.com/office/drawing/2016/5/13/chartex" xmlns:cx8="http://schemas.microsoft.com/office/drawing/2016/5/14/chartex" xmlns:mc="http://schemas.openxmlformats.org/markup-compatibility/2006" xmlns:aink="http://schemas.microsoft.com/office/drawing/2016/ink" xmlns:am3d="http://schemas.microsoft.com/office/drawing/2017/model3d" xmlns:o="urn:schemas-microsoft-com:office:office" xmlns:oel="http://schemas.microsoft.com/office/2019/extlst" xmlns:r="http://schemas.openxmlformats.org/officeDocument/2006/relationships" xmlns:m="http://schemas.openxmlformats.org/officeDocument/2006/math" xmlns:v="urn:schemas-microsoft-com:vml" xmlns:wp14="http://schemas.microsoft.com/office/word/2010/wordprocessingDrawing" xmlns:wp="http://schemas.openxmlformats.org/drawingml/2006/wordprocessingDrawing" xmlns:w10="urn:schemas-microsoft-com:office:word" xmlns:w="http://schemas.openxmlformats.org/wordprocessingml/2006/main" xmlns:w14="http://schemas.microsoft.com/office/word/2010/wordml" xmlns:w15="http://schemas.microsoft.com/office/word/2012/wordml" xmlns:w16cex="http://schemas.microsoft.com/office/word/2018/wordml/cex" xmlns:w16cid="http://schemas.microsoft.com/office/word/2016/wordml/cid" xmlns:w16="http://schemas.microsoft.com/office/word/2018/wordml" xmlns:w16du="http://schemas.microsoft.com/office/word/2023/wordml/word16du" xmlns:w16sdtdh="http://schemas.microsoft.com/office/word/2020/wordml/sdtdatahash" xmlns:w16sdtfl="http://schemas.microsoft.com/office/word/2024/wordml/sdtformatlock" xmlns:w16se="http://schemas.microsoft.com/office/word/2015/wordml/symex" xmlns:wpg="http://schemas.microsoft.com/office/word/2010/wordprocessingGroup" xmlns:wpi="http://schemas.microsoft.com/office/word/2010/wordprocessingInk" xmlns:wne="http://schemas.microsoft.com/office/word/2006/wordml" xmlns:wps="http://schemas.microsoft.com/office/word/2010/wordprocessingShape" mc:Ignorable="w14 w15 w16se w16cid w16 w16cex w16sdtdh w16sdtfl w16du wp14">
   <w:body>
     <w:p>
       <w:pPr>
         <w:pStyle w:val="Heading1"/>
       </w:pPr>
-      <w:bookmarkStart w:id="0" w:name="_Toc240369173"/>
+      <w:bookmarkStart w:id="0" w:name="_Toc240977100"/>
       <w:r>
         <w:t xml:space="preserve">Compsci </w:t>
       </w:r>
@@ -14,83 +14,14 @@
         <w:t>Coursework Project</w:t>
       </w:r>
       <w:bookmarkEnd w:id="0"/>
-    </w:p>
-    <w:p/>
-    <w:p>
-      <w:r>
-        <w:t>Req: Submit evidence of the following:</w:t>
-      </w:r>
-    </w:p>
-    <w:p>
-      <w:pPr>
-        <w:pStyle w:val="ListParagraph"/>
-        <w:numPr>
-          <w:ilvl w:val="0"/>
-          <w:numId w:val="1"/>
-        </w:numPr>
-      </w:pPr>
-      <w:r>
-        <w:t>Stakeholder and target audience summary</w:t>
-      </w:r>
-    </w:p>
-    <w:p>
-      <w:pPr>
-        <w:pStyle w:val="ListParagraph"/>
-        <w:numPr>
-          <w:ilvl w:val="0"/>
-          <w:numId w:val="1"/>
-        </w:numPr>
-      </w:pPr>
-      <w:r>
-        <w:t>Research into similar games, apps, tools or systems</w:t>
-      </w:r>
-    </w:p>
-    <w:p>
-      <w:pPr>
-        <w:pStyle w:val="ListParagraph"/>
-        <w:numPr>
-          <w:ilvl w:val="0"/>
-          <w:numId w:val="1"/>
-        </w:numPr>
-      </w:pPr>
-      <w:r>
-        <w:t>Initial feature list, preferably using MSCW</w:t>
-      </w:r>
-    </w:p>
-    <w:p>
-      <w:pPr>
-        <w:pStyle w:val="ListParagraph"/>
-        <w:numPr>
-          <w:ilvl w:val="0"/>
-          <w:numId w:val="1"/>
-        </w:numPr>
-      </w:pPr>
-      <w:r>
-        <w:t>Evidence of language, IDE or framework upskilling</w:t>
-      </w:r>
-    </w:p>
-    <w:p>
-      <w:pPr>
-        <w:pStyle w:val="ListParagraph"/>
-        <w:numPr>
-          <w:ilvl w:val="0"/>
-          <w:numId w:val="1"/>
-        </w:numPr>
-      </w:pPr>
-      <w:r>
-        <w:t>A short development preparation log</w:t>
-      </w:r>
     </w:p>
     <w:sdt>
       <w:sdtPr>
         <w:rPr>
           <w:rFonts w:asciiTheme="minorHAnsi" w:eastAsiaTheme="minorHAnsi" w:hAnsiTheme="minorHAnsi" w:cstheme="minorBidi"/>
           <w:color w:val="auto"/>
-          <w:kern w:val="2"/>
           <w:sz w:val="24"/>
           <w:szCs w:val="24"/>
-          <w:lang w:val="en-GB"/>
-          <w14:ligatures w14:val="standardContextual"/>
         </w:rPr>
         <w:id w:val="207775503"/>
         <w:docPartObj>
@@ -108,7 +39,7 @@
       <w:sdtContent>
         <w:p>
           <w:pPr>
-            <w:pStyle w:val="TOCHeading"/>
+            <w:pStyle w:val="Heading1"/>
           </w:pPr>
           <w:r>
             <w:t>Contents</w:t>
@@ -135,7 +66,7 @@
           <w:r>
             <w:fldChar w:fldCharType="separate"/>
           </w:r>
-          <w:hyperlink w:anchor="_Toc240369173" w:history="1">
+          <w:hyperlink w:anchor="_Toc240977100" w:history="1">
             <w:r>
               <w:rPr>
                 <w:rStyle w:val="Hyperlink"/>
@@ -162,7 +93,7 @@
                 <w:noProof/>
                 <w:webHidden/>
               </w:rPr>
-              <w:instrText xml:space="preserve"> PAGEREF _Toc240369173 \h </w:instrText>
+              <w:instrText xml:space="preserve"> PAGEREF _Toc240977100 \h </w:instrText>
             </w:r>
             <w:r>
               <w:rPr>
@@ -205,7 +136,7 @@
               <w:lang w:eastAsia="en-GB"/>
             </w:rPr>
           </w:pPr>
-          <w:hyperlink w:anchor="_Toc240369174" w:history="1">
+          <w:hyperlink w:anchor="_Toc240977101" w:history="1">
             <w:r>
               <w:rPr>
                 <w:rStyle w:val="Hyperlink"/>
@@ -232,7 +163,7 @@
                 <w:noProof/>
                 <w:webHidden/>
               </w:rPr>
-              <w:instrText xml:space="preserve"> PAGEREF _Toc240369174 \h </w:instrText>
+              <w:instrText xml:space="preserve"> PAGEREF _Toc240977101 \h </w:instrText>
             </w:r>
             <w:r>
               <w:rPr>
@@ -275,7 +206,7 @@
               <w:lang w:eastAsia="en-GB"/>
             </w:rPr>
           </w:pPr>
-          <w:hyperlink w:anchor="_Toc240369175" w:history="1">
+          <w:hyperlink w:anchor="_Toc240977102" w:history="1">
             <w:r>
               <w:rPr>
                 <w:rStyle w:val="Hyperlink"/>
@@ -302,7 +233,7 @@
                 <w:noProof/>
                 <w:webHidden/>
               </w:rPr>
-              <w:instrText xml:space="preserve"> PAGEREF _Toc240369175 \h </w:instrText>
+              <w:instrText xml:space="preserve"> PAGEREF _Toc240977102 \h </w:instrText>
             </w:r>
             <w:r>
               <w:rPr>
@@ -345,7 +276,7 @@
               <w:lang w:eastAsia="en-GB"/>
             </w:rPr>
           </w:pPr>
-          <w:hyperlink w:anchor="_Toc240369176" w:history="1">
+          <w:hyperlink w:anchor="_Toc240977103" w:history="1">
             <w:r>
               <w:rPr>
                 <w:rStyle w:val="Hyperlink"/>
@@ -372,7 +303,7 @@
                 <w:noProof/>
                 <w:webHidden/>
               </w:rPr>
-              <w:instrText xml:space="preserve"> PAGEREF _Toc240369176 \h </w:instrText>
+              <w:instrText xml:space="preserve"> PAGEREF _Toc240977103 \h </w:instrText>
             </w:r>
             <w:r>
               <w:rPr>
@@ -415,7 +346,7 @@
               <w:lang w:eastAsia="en-GB"/>
             </w:rPr>
           </w:pPr>
-          <w:hyperlink w:anchor="_Toc240369177" w:history="1">
+          <w:hyperlink w:anchor="_Toc240977104" w:history="1">
             <w:r>
               <w:rPr>
                 <w:rStyle w:val="Hyperlink"/>
@@ -442,7 +373,7 @@
                 <w:noProof/>
                 <w:webHidden/>
               </w:rPr>
-              <w:instrText xml:space="preserve"> PAGEREF _Toc240369177 \h </w:instrText>
+              <w:instrText xml:space="preserve"> PAGEREF _Toc240977104 \h </w:instrText>
             </w:r>
             <w:r>
               <w:rPr>
@@ -485,7 +416,7 @@
               <w:lang w:eastAsia="en-GB"/>
             </w:rPr>
           </w:pPr>
-          <w:hyperlink w:anchor="_Toc240369178" w:history="1">
+          <w:hyperlink w:anchor="_Toc240977105" w:history="1">
             <w:r>
               <w:rPr>
                 <w:rStyle w:val="Hyperlink"/>
@@ -512,7 +443,7 @@
                 <w:noProof/>
                 <w:webHidden/>
               </w:rPr>
-              <w:instrText xml:space="preserve"> PAGEREF _Toc240369178 \h </w:instrText>
+              <w:instrText xml:space="preserve"> PAGEREF _Toc240977105 \h </w:instrText>
             </w:r>
             <w:r>
               <w:rPr>
@@ -555,7 +486,7 @@
               <w:lang w:eastAsia="en-GB"/>
             </w:rPr>
           </w:pPr>
-          <w:hyperlink w:anchor="_Toc240369179" w:history="1">
+          <w:hyperlink w:anchor="_Toc240977106" w:history="1">
             <w:r>
               <w:rPr>
                 <w:rStyle w:val="Hyperlink"/>
@@ -582,7 +513,7 @@
                 <w:noProof/>
                 <w:webHidden/>
               </w:rPr>
-              <w:instrText xml:space="preserve"> PAGEREF _Toc240369179 \h </w:instrText>
+              <w:instrText xml:space="preserve"> PAGEREF _Toc240977106 \h </w:instrText>
             </w:r>
             <w:r>
               <w:rPr>
@@ -602,7 +533,7 @@
                 <w:noProof/>
                 <w:webHidden/>
               </w:rPr>
-              <w:t>7</w:t>
+              <w:t>2</w:t>
             </w:r>
             <w:r>
               <w:rPr>
@@ -625,7 +556,7 @@
               <w:lang w:eastAsia="en-GB"/>
             </w:rPr>
           </w:pPr>
-          <w:hyperlink w:anchor="_Toc240369180" w:history="1">
+          <w:hyperlink w:anchor="_Toc240977107" w:history="1">
             <w:r>
               <w:rPr>
                 <w:rStyle w:val="Hyperlink"/>
@@ -652,7 +583,7 @@
                 <w:noProof/>
                 <w:webHidden/>
               </w:rPr>
-              <w:instrText xml:space="preserve"> PAGEREF _Toc240369180 \h </w:instrText>
+              <w:instrText xml:space="preserve"> PAGEREF _Toc240977107 \h </w:instrText>
             </w:r>
             <w:r>
               <w:rPr>
@@ -672,7 +603,7 @@
                 <w:noProof/>
                 <w:webHidden/>
               </w:rPr>
-              <w:t>10</w:t>
+              <w:t>2</w:t>
             </w:r>
             <w:r>
               <w:rPr>
@@ -695,7 +626,7 @@
               <w:lang w:eastAsia="en-GB"/>
             </w:rPr>
           </w:pPr>
-          <w:hyperlink w:anchor="_Toc240369181" w:history="1">
+          <w:hyperlink w:anchor="_Toc240977108" w:history="1">
             <w:r>
               <w:rPr>
                 <w:rStyle w:val="Hyperlink"/>
@@ -722,7 +653,7 @@
                 <w:noProof/>
                 <w:webHidden/>
               </w:rPr>
-              <w:instrText xml:space="preserve"> PAGEREF _Toc240369181 \h </w:instrText>
+              <w:instrText xml:space="preserve"> PAGEREF _Toc240977108 \h </w:instrText>
             </w:r>
             <w:r>
               <w:rPr>
@@ -742,7 +673,7 @@
                 <w:noProof/>
                 <w:webHidden/>
               </w:rPr>
-              <w:t>11</w:t>
+              <w:t>2</w:t>
             </w:r>
             <w:r>
               <w:rPr>
@@ -765,7 +696,7 @@
               <w:lang w:eastAsia="en-GB"/>
             </w:rPr>
           </w:pPr>
-          <w:hyperlink w:anchor="_Toc240369182" w:history="1">
+          <w:hyperlink w:anchor="_Toc240977109" w:history="1">
             <w:r>
               <w:rPr>
                 <w:rStyle w:val="Hyperlink"/>
@@ -792,7 +723,7 @@
                 <w:noProof/>
                 <w:webHidden/>
               </w:rPr>
-              <w:instrText xml:space="preserve"> PAGEREF _Toc240369182 \h </w:instrText>
+              <w:instrText xml:space="preserve"> PAGEREF _Toc240977109 \h </w:instrText>
             </w:r>
             <w:r>
               <w:rPr>
@@ -812,7 +743,7 @@
                 <w:noProof/>
                 <w:webHidden/>
               </w:rPr>
-              <w:t>11</w:t>
+              <w:t>2</w:t>
             </w:r>
             <w:r>
               <w:rPr>
@@ -835,7 +766,7 @@
               <w:lang w:eastAsia="en-GB"/>
             </w:rPr>
           </w:pPr>
-          <w:hyperlink w:anchor="_Toc240369183" w:history="1">
+          <w:hyperlink w:anchor="_Toc240977110" w:history="1">
             <w:r>
               <w:rPr>
                 <w:rStyle w:val="Hyperlink"/>
@@ -862,7 +793,7 @@
                 <w:noProof/>
                 <w:webHidden/>
               </w:rPr>
-              <w:instrText xml:space="preserve"> PAGEREF _Toc240369183 \h </w:instrText>
+              <w:instrText xml:space="preserve"> PAGEREF _Toc240977110 \h </w:instrText>
             </w:r>
             <w:r>
               <w:rPr>
@@ -882,7 +813,7 @@
                 <w:noProof/>
                 <w:webHidden/>
               </w:rPr>
-              <w:t>11</w:t>
+              <w:t>2</w:t>
             </w:r>
             <w:r>
               <w:rPr>
@@ -905,7 +836,7 @@
               <w:lang w:eastAsia="en-GB"/>
             </w:rPr>
           </w:pPr>
-          <w:hyperlink w:anchor="_Toc240369184" w:history="1">
+          <w:hyperlink w:anchor="_Toc240977111" w:history="1">
             <w:r>
               <w:rPr>
                 <w:rStyle w:val="Hyperlink"/>
@@ -932,7 +863,7 @@
                 <w:noProof/>
                 <w:webHidden/>
               </w:rPr>
-              <w:instrText xml:space="preserve"> PAGEREF _Toc240369184 \h </w:instrText>
+              <w:instrText xml:space="preserve"> PAGEREF _Toc240977111 \h </w:instrText>
             </w:r>
             <w:r>
               <w:rPr>
@@ -952,7 +883,7 @@
                 <w:noProof/>
                 <w:webHidden/>
               </w:rPr>
-              <w:t>13</w:t>
+              <w:t>2</w:t>
             </w:r>
             <w:r>
               <w:rPr>
@@ -975,7 +906,7 @@
               <w:lang w:eastAsia="en-GB"/>
             </w:rPr>
           </w:pPr>
-          <w:hyperlink w:anchor="_Toc240369185" w:history="1">
+          <w:hyperlink w:anchor="_Toc240977112" w:history="1">
             <w:r>
               <w:rPr>
                 <w:rStyle w:val="Hyperlink"/>
@@ -1002,7 +933,7 @@
                 <w:noProof/>
                 <w:webHidden/>
               </w:rPr>
-              <w:instrText xml:space="preserve"> PAGEREF _Toc240369185 \h </w:instrText>
+              <w:instrText xml:space="preserve"> PAGEREF _Toc240977112 \h </w:instrText>
             </w:r>
             <w:r>
               <w:rPr>
@@ -1022,7 +953,7 @@
                 <w:noProof/>
                 <w:webHidden/>
               </w:rPr>
-              <w:t>14</w:t>
+              <w:t>2</w:t>
             </w:r>
             <w:r>
               <w:rPr>
@@ -1045,7 +976,7 @@
               <w:lang w:eastAsia="en-GB"/>
             </w:rPr>
           </w:pPr>
-          <w:hyperlink w:anchor="_Toc240369186" w:history="1">
+          <w:hyperlink w:anchor="_Toc240977113" w:history="1">
             <w:r>
               <w:rPr>
                 <w:rStyle w:val="Hyperlink"/>
@@ -1072,7 +1003,7 @@
                 <w:noProof/>
                 <w:webHidden/>
               </w:rPr>
-              <w:instrText xml:space="preserve"> PAGEREF _Toc240369186 \h </w:instrText>
+              <w:instrText xml:space="preserve"> PAGEREF _Toc240977113 \h </w:instrText>
             </w:r>
             <w:r>
               <w:rPr>
@@ -1092,7 +1023,7 @@
                 <w:noProof/>
                 <w:webHidden/>
               </w:rPr>
-              <w:t>15</w:t>
+              <w:t>2</w:t>
             </w:r>
             <w:r>
               <w:rPr>
@@ -1115,7 +1046,7 @@
               <w:lang w:eastAsia="en-GB"/>
             </w:rPr>
           </w:pPr>
-          <w:hyperlink w:anchor="_Toc240369187" w:history="1">
+          <w:hyperlink w:anchor="_Toc240977114" w:history="1">
             <w:r>
               <w:rPr>
                 <w:rStyle w:val="Hyperlink"/>
@@ -1142,7 +1073,7 @@
                 <w:noProof/>
                 <w:webHidden/>
               </w:rPr>
-              <w:instrText xml:space="preserve"> PAGEREF _Toc240369187 \h </w:instrText>
+              <w:instrText xml:space="preserve"> PAGEREF _Toc240977114 \h </w:instrText>
             </w:r>
             <w:r>
               <w:rPr>
@@ -1162,7 +1093,7 @@
                 <w:noProof/>
                 <w:webHidden/>
               </w:rPr>
-              <w:t>15</w:t>
+              <w:t>2</w:t>
             </w:r>
             <w:r>
               <w:rPr>
@@ -1185,7 +1116,7 @@
               <w:lang w:eastAsia="en-GB"/>
             </w:rPr>
           </w:pPr>
-          <w:hyperlink w:anchor="_Toc240369188" w:history="1">
+          <w:hyperlink w:anchor="_Toc240977115" w:history="1">
             <w:r>
               <w:rPr>
                 <w:rStyle w:val="Hyperlink"/>
@@ -1212,7 +1143,7 @@
                 <w:noProof/>
                 <w:webHidden/>
               </w:rPr>
-              <w:instrText xml:space="preserve"> PAGEREF _Toc240369188 \h </w:instrText>
+              <w:instrText xml:space="preserve"> PAGEREF _Toc240977115 \h </w:instrText>
             </w:r>
             <w:r>
               <w:rPr>
@@ -1232,7 +1163,7 @@
                 <w:noProof/>
                 <w:webHidden/>
               </w:rPr>
-              <w:t>15</w:t>
+              <w:t>2</w:t>
             </w:r>
             <w:r>
               <w:rPr>
@@ -1255,7 +1186,7 @@
               <w:lang w:eastAsia="en-GB"/>
             </w:rPr>
           </w:pPr>
-          <w:hyperlink w:anchor="_Toc240369189" w:history="1">
+          <w:hyperlink w:anchor="_Toc240977116" w:history="1">
             <w:r>
               <w:rPr>
                 <w:rStyle w:val="Hyperlink"/>
@@ -1282,7 +1213,7 @@
                 <w:noProof/>
                 <w:webHidden/>
               </w:rPr>
-              <w:instrText xml:space="preserve"> PAGEREF _Toc240369189 \h </w:instrText>
+              <w:instrText xml:space="preserve"> PAGEREF _Toc240977116 \h </w:instrText>
             </w:r>
             <w:r>
               <w:rPr>
@@ -1302,7 +1233,7 @@
                 <w:noProof/>
                 <w:webHidden/>
               </w:rPr>
-              <w:t>15</w:t>
+              <w:t>2</w:t>
             </w:r>
             <w:r>
               <w:rPr>
@@ -1325,7 +1256,7 @@
               <w:lang w:eastAsia="en-GB"/>
             </w:rPr>
           </w:pPr>
-          <w:hyperlink w:anchor="_Toc240369190" w:history="1">
+          <w:hyperlink w:anchor="_Toc240977117" w:history="1">
             <w:r>
               <w:rPr>
                 <w:rStyle w:val="Hyperlink"/>
@@ -1352,7 +1283,7 @@
                 <w:noProof/>
                 <w:webHidden/>
               </w:rPr>
-              <w:instrText xml:space="preserve"> PAGEREF _Toc240369190 \h </w:instrText>
+              <w:instrText xml:space="preserve"> PAGEREF _Toc240977117 \h </w:instrText>
             </w:r>
             <w:r>
               <w:rPr>
@@ -1372,7 +1303,7 @@
                 <w:noProof/>
                 <w:webHidden/>
               </w:rPr>
-              <w:t>16</w:t>
+              <w:t>2</w:t>
             </w:r>
             <w:r>
               <w:rPr>
@@ -1395,7 +1326,7 @@
               <w:lang w:eastAsia="en-GB"/>
             </w:rPr>
           </w:pPr>
-          <w:hyperlink w:anchor="_Toc240369191" w:history="1">
+          <w:hyperlink w:anchor="_Toc240977118" w:history="1">
             <w:r>
               <w:rPr>
                 <w:rStyle w:val="Hyperlink"/>
@@ -1422,7 +1353,7 @@
                 <w:noProof/>
                 <w:webHidden/>
               </w:rPr>
-              <w:instrText xml:space="preserve"> PAGEREF _Toc240369191 \h </w:instrText>
+              <w:instrText xml:space="preserve"> PAGEREF _Toc240977118 \h </w:instrText>
             </w:r>
             <w:r>
               <w:rPr>
@@ -1442,7 +1373,7 @@
                 <w:noProof/>
                 <w:webHidden/>
               </w:rPr>
-              <w:t>16</w:t>
+              <w:t>2</w:t>
             </w:r>
             <w:r>
               <w:rPr>
@@ -1465,7 +1396,7 @@
               <w:lang w:eastAsia="en-GB"/>
             </w:rPr>
           </w:pPr>
-          <w:hyperlink w:anchor="_Toc240369192" w:history="1">
+          <w:hyperlink w:anchor="_Toc240977119" w:history="1">
             <w:r>
               <w:rPr>
                 <w:rStyle w:val="Hyperlink"/>
@@ -1492,7 +1423,7 @@
                 <w:noProof/>
                 <w:webHidden/>
               </w:rPr>
-              <w:instrText xml:space="preserve"> PAGEREF _Toc240369192 \h </w:instrText>
+              <w:instrText xml:space="preserve"> PAGEREF _Toc240977119 \h </w:instrText>
             </w:r>
             <w:r>
               <w:rPr>
@@ -1512,7 +1443,7 @@
                 <w:noProof/>
                 <w:webHidden/>
               </w:rPr>
-              <w:t>16</w:t>
+              <w:t>2</w:t>
             </w:r>
             <w:r>
               <w:rPr>
@@ -1535,7 +1466,7 @@
               <w:lang w:eastAsia="en-GB"/>
             </w:rPr>
           </w:pPr>
-          <w:hyperlink w:anchor="_Toc240369193" w:history="1">
+          <w:hyperlink w:anchor="_Toc240977120" w:history="1">
             <w:r>
               <w:rPr>
                 <w:rStyle w:val="Hyperlink"/>
@@ -1562,7 +1493,7 @@
                 <w:noProof/>
                 <w:webHidden/>
               </w:rPr>
-              <w:instrText xml:space="preserve"> PAGEREF _Toc240369193 \h </w:instrText>
+              <w:instrText xml:space="preserve"> PAGEREF _Toc240977120 \h </w:instrText>
             </w:r>
             <w:r>
               <w:rPr>
@@ -1582,7 +1513,7 @@
                 <w:noProof/>
                 <w:webHidden/>
               </w:rPr>
-              <w:t>16</w:t>
+              <w:t>2</w:t>
             </w:r>
             <w:r>
               <w:rPr>
@@ -1605,7 +1536,7 @@
               <w:lang w:eastAsia="en-GB"/>
             </w:rPr>
           </w:pPr>
-          <w:hyperlink w:anchor="_Toc240369194" w:history="1">
+          <w:hyperlink w:anchor="_Toc240977121" w:history="1">
             <w:r>
               <w:rPr>
                 <w:rStyle w:val="Hyperlink"/>
@@ -1632,7 +1563,7 @@
                 <w:noProof/>
                 <w:webHidden/>
               </w:rPr>
-              <w:instrText xml:space="preserve"> PAGEREF _Toc240369194 \h </w:instrText>
+              <w:instrText xml:space="preserve"> PAGEREF _Toc240977121 \h </w:instrText>
             </w:r>
             <w:r>
               <w:rPr>
@@ -1652,7 +1583,147 @@
                 <w:noProof/>
                 <w:webHidden/>
               </w:rPr>
-              <w:t>16</w:t>
+              <w:t>2</w:t>
+            </w:r>
+            <w:r>
+              <w:rPr>
+                <w:noProof/>
+                <w:webHidden/>
+              </w:rPr>
+              <w:fldChar w:fldCharType="end"/>
+            </w:r>
+          </w:hyperlink>
+        </w:p>
+        <w:p>
+          <w:pPr>
+            <w:pStyle w:val="TOC2"/>
+            <w:tabs>
+              <w:tab w:val="right" w:leader="dot" w:pos="9016"/>
+            </w:tabs>
+            <w:rPr>
+              <w:rFonts w:eastAsiaTheme="minorEastAsia"/>
+              <w:noProof/>
+              <w:lang w:eastAsia="en-GB"/>
+            </w:rPr>
+          </w:pPr>
+          <w:hyperlink w:anchor="_Toc240977122" w:history="1">
+            <w:r>
+              <w:rPr>
+                <w:rStyle w:val="Hyperlink"/>
+                <w:noProof/>
+              </w:rPr>
+              <w:t>Tarot Cards</w:t>
+            </w:r>
+            <w:r>
+              <w:rPr>
+                <w:noProof/>
+                <w:webHidden/>
+              </w:rPr>
+              <w:tab/>
+            </w:r>
+            <w:r>
+              <w:rPr>
+                <w:noProof/>
+                <w:webHidden/>
+              </w:rPr>
+              <w:fldChar w:fldCharType="begin"/>
+            </w:r>
+            <w:r>
+              <w:rPr>
+                <w:noProof/>
+                <w:webHidden/>
+              </w:rPr>
+              <w:instrText xml:space="preserve"> PAGEREF _Toc240977122 \h </w:instrText>
+            </w:r>
+            <w:r>
+              <w:rPr>
+                <w:noProof/>
+                <w:webHidden/>
+              </w:rPr>
+            </w:r>
+            <w:r>
+              <w:rPr>
+                <w:noProof/>
+                <w:webHidden/>
+              </w:rPr>
+              <w:fldChar w:fldCharType="separate"/>
+            </w:r>
+            <w:r>
+              <w:rPr>
+                <w:noProof/>
+                <w:webHidden/>
+              </w:rPr>
+              <w:t>2</w:t>
+            </w:r>
+            <w:r>
+              <w:rPr>
+                <w:noProof/>
+                <w:webHidden/>
+              </w:rPr>
+              <w:fldChar w:fldCharType="end"/>
+            </w:r>
+          </w:hyperlink>
+        </w:p>
+        <w:p>
+          <w:pPr>
+            <w:pStyle w:val="TOC3"/>
+            <w:tabs>
+              <w:tab w:val="right" w:leader="dot" w:pos="9016"/>
+            </w:tabs>
+            <w:rPr>
+              <w:rFonts w:eastAsiaTheme="minorEastAsia"/>
+              <w:noProof/>
+              <w:lang w:eastAsia="en-GB"/>
+            </w:rPr>
+          </w:pPr>
+          <w:hyperlink w:anchor="_Toc240977123" w:history="1">
+            <w:r>
+              <w:rPr>
+                <w:rStyle w:val="Hyperlink"/>
+                <w:noProof/>
+              </w:rPr>
+              <w:t>Major Arcana</w:t>
+            </w:r>
+            <w:r>
+              <w:rPr>
+                <w:noProof/>
+                <w:webHidden/>
+              </w:rPr>
+              <w:tab/>
+            </w:r>
+            <w:r>
+              <w:rPr>
+                <w:noProof/>
+                <w:webHidden/>
+              </w:rPr>
+              <w:fldChar w:fldCharType="begin"/>
+            </w:r>
+            <w:r>
+              <w:rPr>
+                <w:noProof/>
+                <w:webHidden/>
+              </w:rPr>
+              <w:instrText xml:space="preserve"> PAGEREF _Toc240977123 \h </w:instrText>
+            </w:r>
+            <w:r>
+              <w:rPr>
+                <w:noProof/>
+                <w:webHidden/>
+              </w:rPr>
+            </w:r>
+            <w:r>
+              <w:rPr>
+                <w:noProof/>
+                <w:webHidden/>
+              </w:rPr>
+              <w:fldChar w:fldCharType="separate"/>
+            </w:r>
+            <w:r>
+              <w:rPr>
+                <w:noProof/>
+                <w:webHidden/>
+              </w:rPr>
+              <w:t>2</w:t>
             </w:r>
             <w:r>
               <w:rPr>
@@ -1675,7 +1746,7 @@
               <w:lang w:eastAsia="en-GB"/>
             </w:rPr>
           </w:pPr>
-          <w:hyperlink w:anchor="_Toc240369195" w:history="1">
+          <w:hyperlink w:anchor="_Toc240977124" w:history="1">
             <w:r>
               <w:rPr>
                 <w:rStyle w:val="Hyperlink"/>
@@ -1702,7 +1773,7 @@
                 <w:noProof/>
                 <w:webHidden/>
               </w:rPr>
-              <w:instrText xml:space="preserve"> PAGEREF _Toc240369195 \h </w:instrText>
+              <w:instrText xml:space="preserve"> PAGEREF _Toc240977124 \h </w:instrText>
             </w:r>
             <w:r>
               <w:rPr>
@@ -1722,7 +1793,7 @@
                 <w:noProof/>
                 <w:webHidden/>
               </w:rPr>
-              <w:t>17</w:t>
+              <w:t>2</w:t>
             </w:r>
             <w:r>
               <w:rPr>
@@ -1745,7 +1816,7 @@
               <w:lang w:eastAsia="en-GB"/>
             </w:rPr>
           </w:pPr>
-          <w:hyperlink w:anchor="_Toc240369196" w:history="1">
+          <w:hyperlink w:anchor="_Toc240977125" w:history="1">
             <w:r>
               <w:rPr>
                 <w:rStyle w:val="Hyperlink"/>
@@ -1772,7 +1843,7 @@
                 <w:noProof/>
                 <w:webHidden/>
               </w:rPr>
-              <w:instrText xml:space="preserve"> PAGEREF _Toc240369196 \h </w:instrText>
+              <w:instrText xml:space="preserve"> PAGEREF _Toc240977125 \h </w:instrText>
             </w:r>
             <w:r>
               <w:rPr>
@@ -1792,7 +1863,7 @@
                 <w:noProof/>
                 <w:webHidden/>
               </w:rPr>
-              <w:t>17</w:t>
+              <w:t>3</w:t>
             </w:r>
             <w:r>
               <w:rPr>
@@ -1815,7 +1886,7 @@
               <w:lang w:eastAsia="en-GB"/>
             </w:rPr>
           </w:pPr>
-          <w:hyperlink w:anchor="_Toc240369197" w:history="1">
+          <w:hyperlink w:anchor="_Toc240977126" w:history="1">
             <w:r>
               <w:rPr>
                 <w:rStyle w:val="Hyperlink"/>
@@ -1842,7 +1913,7 @@
                 <w:noProof/>
                 <w:webHidden/>
               </w:rPr>
-              <w:instrText xml:space="preserve"> PAGEREF _Toc240369197 \h </w:instrText>
+              <w:instrText xml:space="preserve"> PAGEREF _Toc240977126 \h </w:instrText>
             </w:r>
             <w:r>
               <w:rPr>
@@ -1862,77 +1933,7 @@
                 <w:noProof/>
                 <w:webHidden/>
               </w:rPr>
-              <w:t>17</w:t>
-            </w:r>
-            <w:r>
-              <w:rPr>
-                <w:noProof/>
-                <w:webHidden/>
-              </w:rPr>
-              <w:fldChar w:fldCharType="end"/>
-            </w:r>
-          </w:hyperlink>
-        </w:p>
-        <w:p>
-          <w:pPr>
-            <w:pStyle w:val="TOC1"/>
-            <w:tabs>
-              <w:tab w:val="right" w:leader="dot" w:pos="9016"/>
-            </w:tabs>
-            <w:rPr>
-              <w:rFonts w:eastAsiaTheme="minorEastAsia"/>
-              <w:noProof/>
-              <w:lang w:eastAsia="en-GB"/>
-            </w:rPr>
-          </w:pPr>
-          <w:hyperlink w:anchor="_Toc240369198" w:history="1">
-            <w:r>
-              <w:rPr>
-                <w:rStyle w:val="Hyperlink"/>
-                <w:noProof/>
-              </w:rPr>
-              <w:t>Mark Scheme</w:t>
-            </w:r>
-            <w:r>
-              <w:rPr>
-                <w:noProof/>
-                <w:webHidden/>
-              </w:rPr>
-              <w:tab/>
-            </w:r>
-            <w:r>
-              <w:rPr>
-                <w:noProof/>
-                <w:webHidden/>
-              </w:rPr>
-              <w:fldChar w:fldCharType="begin"/>
-            </w:r>
-            <w:r>
-              <w:rPr>
-                <w:noProof/>
-                <w:webHidden/>
-              </w:rPr>
-              <w:instrText xml:space="preserve"> PAGEREF _Toc240369198 \h </w:instrText>
-            </w:r>
-            <w:r>
-              <w:rPr>
-                <w:noProof/>
-                <w:webHidden/>
-              </w:rPr>
-            </w:r>
-            <w:r>
-              <w:rPr>
-                <w:noProof/>
-                <w:webHidden/>
-              </w:rPr>
-              <w:fldChar w:fldCharType="separate"/>
-            </w:r>
-            <w:r>
-              <w:rPr>
-                <w:noProof/>
-                <w:webHidden/>
-              </w:rPr>
-              <w:t>18</w:t>
+              <w:t>3</w:t>
             </w:r>
             <w:r>
               <w:rPr>
@@ -1950,6 +1951,7 @@
               <w:bCs/>
               <w:noProof/>
             </w:rPr>
+            <w:lastRenderedPageBreak/>
             <w:fldChar w:fldCharType="end"/>
           </w:r>
         </w:p>
@@ -1959,7 +1961,7 @@
       <w:pPr>
         <w:pStyle w:val="Heading1"/>
       </w:pPr>
-      <w:bookmarkStart w:id="1" w:name="_Toc240369174"/>
+      <w:bookmarkStart w:id="1" w:name="_Toc240977101"/>
       <w:r>
         <w:t>Analysis</w:t>
       </w:r>
@@ -1969,7 +1971,7 @@
       <w:pPr>
         <w:pStyle w:val="Heading2"/>
       </w:pPr>
-      <w:bookmarkStart w:id="2" w:name="_Toc240369175"/>
+      <w:bookmarkStart w:id="2" w:name="_Toc240977102"/>
       <w:r>
         <w:t>Project Definition</w:t>
       </w:r>
@@ -2011,7 +2013,7 @@
       <w:pPr>
         <w:pStyle w:val="Heading2"/>
       </w:pPr>
-      <w:bookmarkStart w:id="3" w:name="_Toc240369176"/>
+      <w:bookmarkStart w:id="3" w:name="_Toc240977103"/>
       <w:r>
         <w:t>Stakeholders and Target Audience</w:t>
       </w:r>
@@ -2039,7 +2041,7 @@
       <w:pPr>
         <w:pStyle w:val="Heading2"/>
       </w:pPr>
-      <w:bookmarkStart w:id="4" w:name="_Toc240369177"/>
+      <w:bookmarkStart w:id="4" w:name="_Toc240977104"/>
       <w:r>
         <w:t>Research Similar Products</w:t>
       </w:r>
@@ -2049,7 +2051,7 @@
       <w:pPr>
         <w:pStyle w:val="Heading3"/>
       </w:pPr>
-      <w:bookmarkStart w:id="5" w:name="_Toc240369178"/>
+      <w:bookmarkStart w:id="5" w:name="_Toc240977105"/>
       <w:r>
         <w:t>Example 1: Dead Cells</w:t>
       </w:r>
@@ -2080,11 +2082,7 @@
         <w:t>t</w:t>
       </w:r>
       <w:r>
-        <w:t xml:space="preserve">e Platformer with combat elements and Metroidvania aspects to the level design. Every run, you try to reach a door to the next level (or biome) and can optionally fight enemies to collect “cells”, the game’s form of upgrade currency. Between levels, you can spend these on permanent upgrades that help you progress through the game. Moreover, there are some sporadic boss fights in certain biomes that let you receive “runes”, which essentially give Dead Cells the Metroidvania aspect, as they give extra abilities (often movement based, or environment utility). There are in total 24 standard biomes, where the </w:t>
-      </w:r>
-      <w:r>
-        <w:lastRenderedPageBreak/>
-        <w:t>layout is randomly generated each run, and 12 boss biomes where the design stays consistent.</w:t>
+        <w:t>e Platformer with combat elements and Metroidvania aspects to the level design. Every run, you try to reach a door to the next level (or biome) and can optionally fight enemies to collect “cells”, the game’s form of upgrade currency. Between levels, you can spend these on permanent upgrades that help you progress through the game. Moreover, there are some sporadic boss fights in certain biomes that let you receive “runes”, which essentially give Dead Cells the Metroidvania aspect, as they give extra abilities (often movement based, or environment utility). There are in total 24 standard biomes, where the layout is randomly generated each run, and 12 boss biomes where the design stays consistent.</w:t>
       </w:r>
       <w:r>
         <w:t xml:space="preserve"> </w:t>
@@ -2142,7 +2140,6 @@
         <w:rPr>
           <w:noProof/>
         </w:rPr>
-        <w:lastRenderedPageBreak/>
         <w:drawing>
           <wp:inline distT="0" distB="0" distL="0" distR="0" wp14:anchorId="1C267254" wp14:editId="181C3C6B">
             <wp:extent cx="5172075" cy="5912069"/>
@@ -2220,7 +2217,6 @@
         <w:rPr>
           <w:noProof/>
         </w:rPr>
-        <w:lastRenderedPageBreak/>
         <w:drawing>
           <wp:inline distT="0" distB="0" distL="0" distR="0" wp14:anchorId="4E5536D2" wp14:editId="50DC4F00">
             <wp:extent cx="5731510" cy="3223895"/>
@@ -2313,11 +2309,7 @@
     <w:p/>
     <w:p>
       <w:r>
-        <w:t xml:space="preserve">I also enjoyed the replayability of the game, as aside from its many expansions and biomes you unlock through progression, to officially “beat” Dead Cells you essentially have to </w:t>
-      </w:r>
-      <w:r>
-        <w:lastRenderedPageBreak/>
-        <w:t xml:space="preserve">complete the game 6 times. Each time you defeat the final boss, you get a “Boss Cell”, which </w:t>
+        <w:t xml:space="preserve">I also enjoyed the replayability of the game, as aside from its many expansions and biomes you unlock through progression, to officially “beat” Dead Cells you essentially have to complete the game 6 times. Each time you defeat the final boss, you get a “Boss Cell”, which </w:t>
       </w:r>
       <w:r>
         <w:t xml:space="preserve">drastically </w:t>
@@ -2433,7 +2425,6 @@
     </w:p>
     <w:p>
       <w:r>
-        <w:lastRenderedPageBreak/>
         <w:t>Storage</w:t>
       </w:r>
       <w:r>
@@ -2477,7 +2468,7 @@
       <w:pPr>
         <w:pStyle w:val="Heading3"/>
       </w:pPr>
-      <w:bookmarkStart w:id="6" w:name="_Toc240369179"/>
+      <w:bookmarkStart w:id="6" w:name="_Toc240977106"/>
       <w:r>
         <w:t>Example 2: Undertale</w:t>
       </w:r>
@@ -2511,7 +2502,15 @@
     <w:p/>
     <w:p>
       <w:r>
-        <w:t>If I were to point out some key features in Undertale that I enjoyed, the first would have to be its sound design. The Undertale OST perfectly encapsulates the journey you take through this complex world and leads to some intense moments in the story. Every main encounter has its own motif, and every section of the map has a variety of ambient sounds as well as music that shows the player where they are. In my opinion, the Undertale (and subsequently Deltarune) soundtrack is the best out of any of the games I have played for the emotion it conveys towards the story. In terms of trying to emulate this in my own game, I appreciate Toby Fox’s use of character leitmotifs to connect the world in his game, and I would like to try to add similar features if I choose to do my own soundtrack.</w:t>
+        <w:t xml:space="preserve">If I were to point out some key features in Undertale that I enjoyed, the first would have to be its sound design. The Undertale OST perfectly encapsulates the journey you take through this complex world and leads to some intense moments in the story. Every main encounter has its own motif, and every section of the map has a variety of ambient sounds as well as music that shows the player where they are. In my opinion, the Undertale (and subsequently </w:t>
+      </w:r>
+      <w:proofErr w:type="spellStart"/>
+      <w:r>
+        <w:t>Deltarune</w:t>
+      </w:r>
+      <w:proofErr w:type="spellEnd"/>
+      <w:r>
+        <w:t>) soundtrack is the best out of any of the games I have played for the emotion it conveys towards the story. In terms of trying to emulate this in my own game, I appreciate Toby Fox’s use of character leitmotifs to connect the world in his game, and I would like to try to add similar features if I choose to do my own soundtrack.</w:t>
       </w:r>
     </w:p>
     <w:p/>
@@ -2528,7 +2527,6 @@
         <w:rPr>
           <w:noProof/>
         </w:rPr>
-        <w:lastRenderedPageBreak/>
         <w:drawing>
           <wp:inline distT="0" distB="0" distL="0" distR="0" wp14:anchorId="1919D7AD" wp14:editId="0F73C990">
             <wp:extent cx="3883231" cy="2914359"/>
@@ -2659,7 +2657,6 @@
     </w:p>
     <w:p>
       <w:r>
-        <w:lastRenderedPageBreak/>
         <w:t xml:space="preserve">^ The combat in </w:t>
       </w:r>
       <w:r>
@@ -2776,9 +2773,11 @@
       <w:r>
         <w:t xml:space="preserve">are some </w:t>
       </w:r>
+      <w:proofErr w:type="gramStart"/>
       <w:r>
         <w:t>form</w:t>
       </w:r>
+      <w:proofErr w:type="gramEnd"/>
       <w:r>
         <w:t xml:space="preserve"> of projectile.</w:t>
       </w:r>
@@ -2965,7 +2964,6 @@
         </w:numPr>
       </w:pPr>
       <w:r>
-        <w:lastRenderedPageBreak/>
         <w:t xml:space="preserve">When red, </w:t>
       </w:r>
       <w:r>
@@ -3113,7 +3111,15 @@
         <w:t xml:space="preserve"> In most cases, NPCs can be interacted with to open dialogue with the player.</w:t>
       </w:r>
       <w:r>
-        <w:t xml:space="preserve"> Before the Undyne boss</w:t>
+        <w:t xml:space="preserve"> Before the </w:t>
+      </w:r>
+      <w:proofErr w:type="spellStart"/>
+      <w:r>
+        <w:t>Undyne</w:t>
+      </w:r>
+      <w:proofErr w:type="spellEnd"/>
+      <w:r>
+        <w:t xml:space="preserve"> boss</w:t>
       </w:r>
       <w:r>
         <w:t>-</w:t>
@@ -3136,7 +3142,7 @@
       <w:pPr>
         <w:pStyle w:val="Heading3"/>
       </w:pPr>
-      <w:bookmarkStart w:id="7" w:name="_Toc240369180"/>
+      <w:bookmarkStart w:id="7" w:name="_Toc240977107"/>
       <w:r>
         <w:t>Some more</w:t>
       </w:r>
@@ -3225,7 +3231,6 @@
           <w:b/>
           <w:bCs/>
         </w:rPr>
-        <w:lastRenderedPageBreak/>
         <w:t>Detroit: Become Human</w:t>
       </w:r>
       <w:r>
@@ -3244,7 +3249,7 @@
       <w:pPr>
         <w:pStyle w:val="Heading2"/>
       </w:pPr>
-      <w:bookmarkStart w:id="8" w:name="_Toc240369181"/>
+      <w:bookmarkStart w:id="8" w:name="_Toc240977108"/>
       <w:r>
         <w:t>Initial Feature List</w:t>
       </w:r>
@@ -3254,7 +3259,7 @@
       <w:pPr>
         <w:pStyle w:val="Heading3"/>
       </w:pPr>
-      <w:bookmarkStart w:id="9" w:name="_Toc240369182"/>
+      <w:bookmarkStart w:id="9" w:name="_Toc240977109"/>
       <w:r>
         <w:t>Must have:</w:t>
       </w:r>
@@ -3632,7 +3637,7 @@
       <w:pPr>
         <w:pStyle w:val="Heading3"/>
       </w:pPr>
-      <w:bookmarkStart w:id="10" w:name="_Toc240369183"/>
+      <w:bookmarkStart w:id="10" w:name="_Toc240977110"/>
       <w:r>
         <w:t>Should have:</w:t>
       </w:r>
@@ -3716,7 +3721,6 @@
           </w:tcPr>
           <w:p>
             <w:r>
-              <w:lastRenderedPageBreak/>
               <w:t>A range of permanent upgrades</w:t>
             </w:r>
           </w:p>
@@ -3986,11 +3990,7 @@
           </w:tcPr>
           <w:p>
             <w:r>
-              <w:t xml:space="preserve">I want the player to have a simplified view of their inventory, health and minimap, so they don’t need to access menus to be able to check these things, </w:t>
-            </w:r>
-            <w:r>
-              <w:lastRenderedPageBreak/>
-              <w:t>maximising the time they spend actually playing</w:t>
+              <w:t>I want the player to have a simplified view of their inventory, health and minimap, so they don’t need to access menus to be able to check these things, maximising the time they spend actually playing</w:t>
             </w:r>
             <w:r>
               <w:t xml:space="preserve"> as opposed to searching for information</w:t>
@@ -4004,7 +4004,7 @@
       <w:pPr>
         <w:pStyle w:val="Heading3"/>
       </w:pPr>
-      <w:bookmarkStart w:id="11" w:name="_Toc240369184"/>
+      <w:bookmarkStart w:id="11" w:name="_Toc240977111"/>
       <w:r>
         <w:t>Could have:</w:t>
       </w:r>
@@ -4287,7 +4287,6 @@
           </w:tcPr>
           <w:p>
             <w:r>
-              <w:lastRenderedPageBreak/>
               <w:t>Branching story and dialogue</w:t>
             </w:r>
           </w:p>
@@ -4377,7 +4376,7 @@
       <w:pPr>
         <w:pStyle w:val="Heading3"/>
       </w:pPr>
-      <w:bookmarkStart w:id="12" w:name="_Toc240369185"/>
+      <w:bookmarkStart w:id="12" w:name="_Toc240977112"/>
       <w:r>
         <w:t>Won’t have:</w:t>
       </w:r>
@@ -4624,7 +4623,6 @@
           </w:tcPr>
           <w:p>
             <w:r>
-              <w:lastRenderedPageBreak/>
               <w:t>Overly deep narrative trees</w:t>
             </w:r>
           </w:p>
@@ -4659,7 +4657,7 @@
       <w:pPr>
         <w:pStyle w:val="Heading2"/>
       </w:pPr>
-      <w:bookmarkStart w:id="13" w:name="_Toc240369186"/>
+      <w:bookmarkStart w:id="13" w:name="_Toc240977113"/>
       <w:r>
         <w:t>Success Criteria</w:t>
       </w:r>
@@ -4992,7 +4990,6 @@
           </w:tcPr>
           <w:p>
             <w:r>
-              <w:lastRenderedPageBreak/>
               <w:t>The player should be able to interact with the menu screens</w:t>
             </w:r>
           </w:p>
@@ -5309,7 +5306,7 @@
       <w:pPr>
         <w:pStyle w:val="Heading2"/>
       </w:pPr>
-      <w:bookmarkStart w:id="14" w:name="_Toc240369187"/>
+      <w:bookmarkStart w:id="14" w:name="_Toc240977114"/>
       <w:r>
         <w:t>Hardware and Software Requirements</w:t>
       </w:r>
@@ -5398,7 +5395,6 @@
           </w:tcPr>
           <w:p>
             <w:r>
-              <w:lastRenderedPageBreak/>
               <w:t>Graphics</w:t>
             </w:r>
           </w:p>
@@ -5442,7 +5438,7 @@
       <w:pPr>
         <w:pStyle w:val="Heading2"/>
       </w:pPr>
-      <w:bookmarkStart w:id="15" w:name="_Toc240369188"/>
+      <w:bookmarkStart w:id="15" w:name="_Toc240977115"/>
       <w:r>
         <w:t>Essential Computational Features</w:t>
       </w:r>
@@ -5452,7 +5448,7 @@
       <w:pPr>
         <w:pStyle w:val="Heading3"/>
       </w:pPr>
-      <w:bookmarkStart w:id="16" w:name="_Toc240369189"/>
+      <w:bookmarkStart w:id="16" w:name="_Toc240977116"/>
       <w:r>
         <w:t>Abstraction:</w:t>
       </w:r>
@@ -5486,7 +5482,7 @@
       <w:pPr>
         <w:pStyle w:val="Heading3"/>
       </w:pPr>
-      <w:bookmarkStart w:id="17" w:name="_Toc240369190"/>
+      <w:bookmarkStart w:id="17" w:name="_Toc240977117"/>
       <w:r>
         <w:t>Thinking Ahead:</w:t>
       </w:r>
@@ -5588,7 +5584,7 @@
       <w:pPr>
         <w:pStyle w:val="Heading3"/>
       </w:pPr>
-      <w:bookmarkStart w:id="18" w:name="_Toc240369191"/>
+      <w:bookmarkStart w:id="18" w:name="_Toc240977118"/>
       <w:r>
         <w:t>Thinking procedurally</w:t>
       </w:r>
@@ -5615,7 +5611,7 @@
       <w:pPr>
         <w:pStyle w:val="Heading3"/>
       </w:pPr>
-      <w:bookmarkStart w:id="19" w:name="_Toc240369192"/>
+      <w:bookmarkStart w:id="19" w:name="_Toc240977119"/>
       <w:r>
         <w:t>Thinking concurrently*:</w:t>
       </w:r>
@@ -5626,38 +5622,559 @@
       <w:pPr>
         <w:pStyle w:val="Heading1"/>
       </w:pPr>
-      <w:bookmarkStart w:id="20" w:name="_Toc240369193"/>
+      <w:bookmarkStart w:id="20" w:name="_Toc240977120"/>
+      <w:r>
+        <w:t>De</w:t>
+      </w:r>
+      <w:r>
+        <w:t>sign</w:t>
+      </w:r>
+      <w:bookmarkEnd w:id="20"/>
+    </w:p>
+    <w:p>
+      <w:pPr>
+        <w:pStyle w:val="Heading2"/>
+      </w:pPr>
+      <w:bookmarkStart w:id="21" w:name="_Toc240977121"/>
+      <w:r>
+        <w:t>Coursework Weapons and Combat</w:t>
+      </w:r>
+      <w:bookmarkEnd w:id="21"/>
+    </w:p>
+    <w:p>
+      <w:r>
+        <w:t xml:space="preserve">In my project, I want a wide range of weapons in terms of damage, speed, range and AOE, plus additional unique effects applied to all so every weapon feels different to use and can encourage a new playstyle. I also want each weapon to be visually unique so a player can recognise weapons that they like from a distance even when not hovering over with their mouse. I want each weapon to have some basic description, basic stat breakdown and active effects shown on screen when a player hovers over it and is standing near that weapon. I may also potentially add an option to see a detailed statistical breakdown in a side menu. I want the player to be able to wield 1-2 weapons, with standard weapons taking up 1 slot and heavy weapons taking up 2. If the player chooses to wield 2 of the same </w:t>
+      </w:r>
+      <w:r>
+        <w:t>weapons</w:t>
+      </w:r>
+      <w:r>
+        <w:t>, I want to implement an akimbo move-set with potentially unique and additional moves. I think that limiting the second weapon slot to the first introductory upgrade will be a good step to encourage the player to push for completion and will be rewarding when unlocked. I think it would be a good idea to feature multiple distinct tiers of weapon, so that scaling can be applied on a wider scale and the player has a general sense of the power of their weapon if they haven't used it before</w:t>
+      </w:r>
+      <w:r>
+        <w:t>.</w:t>
+      </w:r>
+    </w:p>
+    <w:p/>
+    <w:p>
+      <w:pPr>
+        <w:pStyle w:val="Heading2"/>
+      </w:pPr>
+      <w:bookmarkStart w:id="22" w:name="_Toc240977122"/>
+      <w:r>
+        <w:t>Tarot Cards</w:t>
+      </w:r>
+      <w:bookmarkEnd w:id="22"/>
+    </w:p>
+    <w:p>
+      <w:pPr>
+        <w:pStyle w:val="Heading3"/>
+      </w:pPr>
+      <w:bookmarkStart w:id="23" w:name="_Toc240977123"/>
+      <w:r>
+        <w:t>Major Arcana</w:t>
+      </w:r>
+      <w:bookmarkEnd w:id="23"/>
+    </w:p>
+    <w:p>
+      <w:r>
+        <w:t>The</w:t>
+      </w:r>
+      <w:r>
+        <w:t xml:space="preserve"> 22 Major Arcana cards are numbered 0 (The Fool) through 21 (The World). They represent significant archetypal force</w:t>
+      </w:r>
+      <w:r>
+        <w:t>s and life themes, and carry more weight in a reading than Minor Arcana cards.</w:t>
+      </w:r>
+      <w:r>
+        <w:rPr>
+          <w:rStyle w:val="FootnoteReference"/>
+        </w:rPr>
+        <w:footnoteReference w:id="11"/>
+      </w:r>
+    </w:p>
+    <w:p>
+      <w:pPr>
+        <w:pStyle w:val="ListParagraph"/>
+        <w:numPr>
+          <w:ilvl w:val="0"/>
+          <w:numId w:val="9"/>
+        </w:numPr>
+      </w:pPr>
+      <w:r>
+        <w:t xml:space="preserve">      </w:t>
+      </w:r>
+      <w:r>
+        <w:t>The Fool</w:t>
+      </w:r>
+    </w:p>
+    <w:p>
+      <w:pPr>
+        <w:pStyle w:val="ListParagraph"/>
+        <w:numPr>
+          <w:ilvl w:val="2"/>
+          <w:numId w:val="2"/>
+        </w:numPr>
+      </w:pPr>
+      <w:r>
+        <w:t>New beginnings, innocence, spontaneity, free spirit</w:t>
+      </w:r>
+    </w:p>
+    <w:p>
+      <w:pPr>
+        <w:pStyle w:val="ListParagraph"/>
+        <w:numPr>
+          <w:ilvl w:val="0"/>
+          <w:numId w:val="10"/>
+        </w:numPr>
+      </w:pPr>
+      <w:r>
+        <w:t>The Magician</w:t>
+      </w:r>
+    </w:p>
+    <w:p>
+      <w:pPr>
+        <w:pStyle w:val="ListParagraph"/>
+        <w:numPr>
+          <w:ilvl w:val="2"/>
+          <w:numId w:val="2"/>
+        </w:numPr>
+      </w:pPr>
+      <w:r>
+        <w:t>Manifestation, resourcefulness, power, inspired action</w:t>
+      </w:r>
+    </w:p>
+    <w:p>
+      <w:pPr>
+        <w:pStyle w:val="ListParagraph"/>
+        <w:numPr>
+          <w:ilvl w:val="0"/>
+          <w:numId w:val="10"/>
+        </w:numPr>
+      </w:pPr>
+      <w:r>
+        <w:t>The High Priestess</w:t>
+      </w:r>
+    </w:p>
+    <w:p>
+      <w:pPr>
+        <w:pStyle w:val="ListParagraph"/>
+        <w:numPr>
+          <w:ilvl w:val="2"/>
+          <w:numId w:val="2"/>
+        </w:numPr>
+      </w:pPr>
+      <w:r>
+        <w:t>Intuition, sacred knowledge, divine feminine, subconscious mind</w:t>
+      </w:r>
+    </w:p>
+    <w:p>
+      <w:pPr>
+        <w:pStyle w:val="ListParagraph"/>
+        <w:numPr>
+          <w:ilvl w:val="0"/>
+          <w:numId w:val="10"/>
+        </w:numPr>
+      </w:pPr>
+      <w:r>
+        <w:t>The Empress</w:t>
+      </w:r>
+    </w:p>
+    <w:p>
+      <w:pPr>
+        <w:pStyle w:val="ListParagraph"/>
+        <w:numPr>
+          <w:ilvl w:val="2"/>
+          <w:numId w:val="2"/>
+        </w:numPr>
+      </w:pPr>
+      <w:r>
+        <w:t>Femininity, beauty, nature, nurturing, abundance</w:t>
+      </w:r>
+    </w:p>
+    <w:p>
+      <w:pPr>
+        <w:pStyle w:val="ListParagraph"/>
+        <w:numPr>
+          <w:ilvl w:val="0"/>
+          <w:numId w:val="10"/>
+        </w:numPr>
+      </w:pPr>
+      <w:r>
+        <w:t>The Emperor</w:t>
+      </w:r>
+    </w:p>
+    <w:p>
+      <w:pPr>
+        <w:pStyle w:val="ListParagraph"/>
+        <w:numPr>
+          <w:ilvl w:val="2"/>
+          <w:numId w:val="2"/>
+        </w:numPr>
+      </w:pPr>
+      <w:r>
+        <w:t>Authority, establishment, structure, father figure</w:t>
+      </w:r>
+    </w:p>
+    <w:p>
+      <w:pPr>
+        <w:pStyle w:val="ListParagraph"/>
+        <w:numPr>
+          <w:ilvl w:val="0"/>
+          <w:numId w:val="10"/>
+        </w:numPr>
+      </w:pPr>
+      <w:r>
+        <w:t>The Hierophant</w:t>
+      </w:r>
+    </w:p>
+    <w:p>
+      <w:pPr>
+        <w:pStyle w:val="ListParagraph"/>
+        <w:numPr>
+          <w:ilvl w:val="2"/>
+          <w:numId w:val="2"/>
+        </w:numPr>
+      </w:pPr>
+      <w:r>
+        <w:t>Spiritual wisdom, religious beliefs, conformity, tradition</w:t>
+      </w:r>
+    </w:p>
+    <w:p>
+      <w:pPr>
+        <w:pStyle w:val="ListParagraph"/>
+        <w:numPr>
+          <w:ilvl w:val="0"/>
+          <w:numId w:val="10"/>
+        </w:numPr>
+      </w:pPr>
+      <w:r>
+        <w:t>The Lover</w:t>
+      </w:r>
+      <w:r>
+        <w:t>s</w:t>
+      </w:r>
+    </w:p>
+    <w:p>
+      <w:pPr>
+        <w:pStyle w:val="ListParagraph"/>
+        <w:numPr>
+          <w:ilvl w:val="2"/>
+          <w:numId w:val="2"/>
+        </w:numPr>
+      </w:pPr>
+      <w:r>
+        <w:t>Love, harmony, values alignment, choices</w:t>
+      </w:r>
+    </w:p>
+    <w:p>
+      <w:pPr>
+        <w:pStyle w:val="ListParagraph"/>
+        <w:numPr>
+          <w:ilvl w:val="0"/>
+          <w:numId w:val="10"/>
+        </w:numPr>
+      </w:pPr>
+      <w:r>
+        <w:t>The Chariot</w:t>
+      </w:r>
+    </w:p>
+    <w:p>
+      <w:pPr>
+        <w:pStyle w:val="ListParagraph"/>
+        <w:numPr>
+          <w:ilvl w:val="2"/>
+          <w:numId w:val="2"/>
+        </w:numPr>
+      </w:pPr>
+      <w:r>
+        <w:t>Control, willpower, success, action, determination</w:t>
+      </w:r>
+    </w:p>
+    <w:p>
+      <w:pPr>
+        <w:pStyle w:val="ListParagraph"/>
+        <w:numPr>
+          <w:ilvl w:val="0"/>
+          <w:numId w:val="10"/>
+        </w:numPr>
+      </w:pPr>
+      <w:r>
+        <w:t>Strength</w:t>
+      </w:r>
+    </w:p>
+    <w:p>
+      <w:pPr>
+        <w:pStyle w:val="ListParagraph"/>
+        <w:numPr>
+          <w:ilvl w:val="2"/>
+          <w:numId w:val="2"/>
+        </w:numPr>
+      </w:pPr>
+      <w:r>
+        <w:t>Strength, courage, persuasion, influence, compassion</w:t>
+      </w:r>
+    </w:p>
+    <w:p>
+      <w:pPr>
+        <w:pStyle w:val="ListParagraph"/>
+        <w:numPr>
+          <w:ilvl w:val="0"/>
+          <w:numId w:val="10"/>
+        </w:numPr>
+      </w:pPr>
+      <w:r>
+        <w:t>The Hermit</w:t>
+      </w:r>
+    </w:p>
+    <w:p>
+      <w:pPr>
+        <w:pStyle w:val="ListParagraph"/>
+        <w:numPr>
+          <w:ilvl w:val="2"/>
+          <w:numId w:val="2"/>
+        </w:numPr>
+      </w:pPr>
+      <w:r>
+        <w:t>Soul searching, introspection, being alone, inner guidance</w:t>
+      </w:r>
+    </w:p>
+    <w:p>
+      <w:pPr>
+        <w:pStyle w:val="ListParagraph"/>
+        <w:numPr>
+          <w:ilvl w:val="0"/>
+          <w:numId w:val="10"/>
+        </w:numPr>
+      </w:pPr>
+      <w:r>
+        <w:t>Wheel of Fortune</w:t>
+      </w:r>
+    </w:p>
+    <w:p>
+      <w:pPr>
+        <w:pStyle w:val="ListParagraph"/>
+        <w:numPr>
+          <w:ilvl w:val="2"/>
+          <w:numId w:val="2"/>
+        </w:numPr>
+      </w:pPr>
+      <w:r>
+        <w:t>Good luck, karma, life cycles, destiny, turning point</w:t>
+      </w:r>
+    </w:p>
+    <w:p>
+      <w:pPr>
+        <w:pStyle w:val="ListParagraph"/>
+        <w:numPr>
+          <w:ilvl w:val="0"/>
+          <w:numId w:val="10"/>
+        </w:numPr>
+      </w:pPr>
+      <w:r>
+        <w:t>Justice</w:t>
+      </w:r>
+    </w:p>
+    <w:p>
+      <w:pPr>
+        <w:pStyle w:val="ListParagraph"/>
+        <w:numPr>
+          <w:ilvl w:val="2"/>
+          <w:numId w:val="2"/>
+        </w:numPr>
+      </w:pPr>
+      <w:r>
+        <w:t>Justice, fairness, truth, cause and effect, law</w:t>
+      </w:r>
+    </w:p>
+    <w:p>
+      <w:pPr>
+        <w:pStyle w:val="ListParagraph"/>
+        <w:numPr>
+          <w:ilvl w:val="0"/>
+          <w:numId w:val="10"/>
+        </w:numPr>
+      </w:pPr>
       <w:r>
         <w:lastRenderedPageBreak/>
-        <w:t>De</w:t>
-      </w:r>
-      <w:r>
-        <w:t>sign</w:t>
-      </w:r>
-      <w:bookmarkEnd w:id="20"/>
-    </w:p>
-    <w:p>
-      <w:pPr>
-        <w:pStyle w:val="Heading2"/>
-      </w:pPr>
-      <w:bookmarkStart w:id="21" w:name="_Toc240369194"/>
-      <w:r>
-        <w:t>Coursework Weapons and Combat</w:t>
-      </w:r>
-      <w:bookmarkEnd w:id="21"/>
-    </w:p>
-    <w:p>
-      <w:r>
-        <w:t xml:space="preserve">In my project, I want a wide range of weapons in terms of damage, speed, range and AOE, plus additional unique effects applied to all so every weapon feels different to use and can encourage a new playstyle. I also want each weapon to be visually unique so a player can recognise weapons that they like from a distance even when not hovering over with their mouse. I want each weapon to have some basic description, basic stat breakdown and active effects shown on screen when a player hovers over it and is standing near that weapon. I may also potentially add an option to see a detailed statistical breakdown in a side menu. I want the player to be able to wield 1-2 weapons, with standard weapons taking up 1 slot and heavy weapons taking up 2. If the player chooses to wield 2 of the same </w:t>
-      </w:r>
-      <w:r>
-        <w:t>weapons</w:t>
-      </w:r>
-      <w:r>
-        <w:t>, I want to implement an akimbo move-set with potentially unique and additional moves. I think that limiting the second weapon slot to the first introductory upgrade will be a good step to encourage the player to push for completion and will be rewarding when unlocked. I think it would be a good idea to feature multiple distinct tiers of weapon, so that scaling can be applied on a wider scale and the player has a general sense of the power of their weapon if they haven't used it before</w:t>
-      </w:r>
-      <w:r>
-        <w:t>.</w:t>
+        <w:t>The Hanged Man</w:t>
+      </w:r>
+    </w:p>
+    <w:p>
+      <w:pPr>
+        <w:pStyle w:val="ListParagraph"/>
+        <w:numPr>
+          <w:ilvl w:val="2"/>
+          <w:numId w:val="2"/>
+        </w:numPr>
+      </w:pPr>
+      <w:r>
+        <w:t>Pause, surrender, letting go, new perspectives</w:t>
+      </w:r>
+    </w:p>
+    <w:p>
+      <w:pPr>
+        <w:pStyle w:val="ListParagraph"/>
+        <w:numPr>
+          <w:ilvl w:val="0"/>
+          <w:numId w:val="10"/>
+        </w:numPr>
+      </w:pPr>
+      <w:r>
+        <w:t>Death</w:t>
+      </w:r>
+    </w:p>
+    <w:p>
+      <w:pPr>
+        <w:pStyle w:val="ListParagraph"/>
+        <w:numPr>
+          <w:ilvl w:val="2"/>
+          <w:numId w:val="2"/>
+        </w:numPr>
+      </w:pPr>
+      <w:r>
+        <w:t>Endings, change, transformation, transition</w:t>
+      </w:r>
+    </w:p>
+    <w:p>
+      <w:pPr>
+        <w:pStyle w:val="ListParagraph"/>
+        <w:numPr>
+          <w:ilvl w:val="0"/>
+          <w:numId w:val="10"/>
+        </w:numPr>
+      </w:pPr>
+      <w:r>
+        <w:t>Temperance</w:t>
+      </w:r>
+    </w:p>
+    <w:p>
+      <w:pPr>
+        <w:pStyle w:val="ListParagraph"/>
+        <w:numPr>
+          <w:ilvl w:val="2"/>
+          <w:numId w:val="2"/>
+        </w:numPr>
+      </w:pPr>
+      <w:r>
+        <w:t>Balance, moderation, patience, purpose</w:t>
+      </w:r>
+    </w:p>
+    <w:p>
+      <w:pPr>
+        <w:pStyle w:val="ListParagraph"/>
+        <w:numPr>
+          <w:ilvl w:val="0"/>
+          <w:numId w:val="10"/>
+        </w:numPr>
+      </w:pPr>
+      <w:r>
+        <w:t>The Devil</w:t>
+      </w:r>
+    </w:p>
+    <w:p>
+      <w:pPr>
+        <w:pStyle w:val="ListParagraph"/>
+        <w:numPr>
+          <w:ilvl w:val="2"/>
+          <w:numId w:val="2"/>
+        </w:numPr>
+      </w:pPr>
+      <w:r>
+        <w:t>Shadow self, attachment, addiction, restriction, sexuality</w:t>
+      </w:r>
+    </w:p>
+    <w:p>
+      <w:pPr>
+        <w:pStyle w:val="ListParagraph"/>
+        <w:numPr>
+          <w:ilvl w:val="0"/>
+          <w:numId w:val="10"/>
+        </w:numPr>
+      </w:pPr>
+      <w:r>
+        <w:t>The Tower</w:t>
+      </w:r>
+    </w:p>
+    <w:p>
+      <w:pPr>
+        <w:pStyle w:val="ListParagraph"/>
+        <w:numPr>
+          <w:ilvl w:val="2"/>
+          <w:numId w:val="2"/>
+        </w:numPr>
+      </w:pPr>
+      <w:r>
+        <w:t>Sudden change, upheaval, chaos, revelation, awakening</w:t>
+      </w:r>
+    </w:p>
+    <w:p>
+      <w:pPr>
+        <w:pStyle w:val="ListParagraph"/>
+        <w:numPr>
+          <w:ilvl w:val="0"/>
+          <w:numId w:val="10"/>
+        </w:numPr>
+      </w:pPr>
+      <w:r>
+        <w:t>The Star</w:t>
+      </w:r>
+    </w:p>
+    <w:p>
+      <w:pPr>
+        <w:pStyle w:val="ListParagraph"/>
+        <w:numPr>
+          <w:ilvl w:val="2"/>
+          <w:numId w:val="2"/>
+        </w:numPr>
+      </w:pPr>
+    </w:p>
+    <w:p>
+      <w:pPr>
+        <w:pStyle w:val="ListParagraph"/>
+        <w:numPr>
+          <w:ilvl w:val="0"/>
+          <w:numId w:val="10"/>
+        </w:numPr>
+      </w:pPr>
+      <w:r>
+        <w:t>The Moon</w:t>
+      </w:r>
+    </w:p>
+    <w:p>
+      <w:pPr>
+        <w:pStyle w:val="ListParagraph"/>
+        <w:numPr>
+          <w:ilvl w:val="0"/>
+          <w:numId w:val="10"/>
+        </w:numPr>
+      </w:pPr>
+      <w:r>
+        <w:t>The Sun</w:t>
+      </w:r>
+    </w:p>
+    <w:p>
+      <w:pPr>
+        <w:pStyle w:val="ListParagraph"/>
+        <w:numPr>
+          <w:ilvl w:val="0"/>
+          <w:numId w:val="10"/>
+        </w:numPr>
+      </w:pPr>
+      <w:r>
+        <w:t>Judgement</w:t>
+      </w:r>
+    </w:p>
+    <w:p>
+      <w:pPr>
+        <w:pStyle w:val="ListParagraph"/>
+        <w:numPr>
+          <w:ilvl w:val="0"/>
+          <w:numId w:val="10"/>
+        </w:numPr>
+      </w:pPr>
+      <w:r>
+        <w:t>The World</w:t>
       </w:r>
     </w:p>
     <w:p/>
@@ -5665,28 +6182,28 @@
       <w:pPr>
         <w:pStyle w:val="Heading1"/>
       </w:pPr>
-      <w:bookmarkStart w:id="22" w:name="_Toc240369195"/>
+      <w:bookmarkStart w:id="24" w:name="_Toc240977124"/>
       <w:r>
         <w:t>Development</w:t>
       </w:r>
-      <w:bookmarkEnd w:id="22"/>
+      <w:bookmarkEnd w:id="24"/>
     </w:p>
     <w:p/>
     <w:p>
       <w:pPr>
         <w:pStyle w:val="Heading1"/>
       </w:pPr>
-      <w:bookmarkStart w:id="23" w:name="_Toc240369196"/>
+      <w:bookmarkStart w:id="25" w:name="_Toc240977125"/>
       <w:r>
         <w:t>Evaluation</w:t>
       </w:r>
-      <w:bookmarkEnd w:id="23"/>
+      <w:bookmarkEnd w:id="25"/>
     </w:p>
     <w:p/>
     <w:p/>
     <w:p/>
     <w:p/>
-    <w:bookmarkStart w:id="24" w:name="_Toc240369197" w:displacedByCustomXml="next"/>
+    <w:bookmarkStart w:id="26" w:name="_Toc240977126" w:displacedByCustomXml="next"/>
     <w:sdt>
       <w:sdtPr>
         <w:rPr>
@@ -5710,7 +6227,7 @@
           <w:r>
             <w:t>References</w:t>
           </w:r>
-          <w:bookmarkEnd w:id="24"/>
+          <w:bookmarkEnd w:id="26"/>
         </w:p>
         <w:sdt>
           <w:sdtPr>
@@ -5802,7 +6319,6 @@
                 <w:rPr>
                   <w:noProof/>
                 </w:rPr>
-                <w:lastRenderedPageBreak/>
                 <w:t>Hollow Knight. (2017, February 24). Team Cherry.</w:t>
               </w:r>
             </w:p>
@@ -5847,6 +6363,7 @@
                 <w:rPr>
                   <w:noProof/>
                 </w:rPr>
+                <w:lastRenderedPageBreak/>
                 <w:t xml:space="preserve">Toby Fox. (2015). </w:t>
               </w:r>
               <w:r>
@@ -5948,7 +6465,7 @@
 </file>
 
 <file path=word/endnotes.xml><?xml version="1.0" encoding="utf-8"?>
-<w:endnotes xmlns:wpc="http://schemas.microsoft.com/office/word/2010/wordprocessingCanvas" xmlns:cx="http://schemas.microsoft.com/office/drawing/2014/chartex" xmlns:cx1="http://schemas.microsoft.com/office/drawing/2015/9/8/chartex" xmlns:cx2="http://schemas.microsoft.com/office/drawing/2015/10/21/chartex" xmlns:cx3="http://schemas.microsoft.com/office/drawing/2016/5/9/chartex" xmlns:cx4="http://schemas.microsoft.com/office/drawing/2016/5/10/chartex" xmlns:cx5="http://schemas.microsoft.com/office/drawing/2016/5/11/chartex" xmlns:cx6="http://schemas.microsoft.com/office/drawing/2016/5/12/chartex" xmlns:cx7="http://schemas.microsoft.com/office/drawing/2016/5/13/chartex" xmlns:cx8="http://schemas.microsoft.com/office/drawing/2016/5/14/chartex" xmlns:mc="http://schemas.openxmlformats.org/markup-compatibility/2006" xmlns:aink="http://schemas.microsoft.com/office/drawing/2016/ink" xmlns:am3d="http://schemas.microsoft.com/office/drawing/2017/model3d" xmlns:o="urn:schemas-microsoft-com:office:office" xmlns:oel="http://schemas.microsoft.com/office/2019/extlst" xmlns:r="http://schemas.openxmlformats.org/officeDocument/2006/relationships" xmlns:m="http://schemas.openxmlformats.org/officeDocument/2006/math" xmlns:v="urn:schemas-microsoft-com:vml" xmlns:wp14="http://schemas.microsoft.com/office/word/2010/wordprocessingDrawing" xmlns:wp="http://schemas.openxmlformats.org/drawingml/2006/wordprocessingDrawing" xmlns:w10="urn:schemas-microsoft-com:office:word" xmlns:w="http://schemas.openxmlformats.org/wordprocessingml/2006/main" xmlns:w14="http://schemas.microsoft.com/office/word/2010/wordml" xmlns:w15="http://schemas.microsoft.com/office/word/2012/wordml" xmlns:w16cei="http://schemas.microsoft.com/office/word/2026/wordml/cei" xmlns:w16cex="http://schemas.microsoft.com/office/word/2018/wordml/cex" xmlns:w16cid="http://schemas.microsoft.com/office/word/2016/wordml/cid" xmlns:w16="http://schemas.microsoft.com/office/word/2018/wordml" xmlns:w16du="http://schemas.microsoft.com/office/word/2023/wordml/word16du" xmlns:w16sdtdh="http://schemas.microsoft.com/office/word/2020/wordml/sdtdatahash" xmlns:w16sdtfl="http://schemas.microsoft.com/office/word/2024/wordml/sdtformatlock" xmlns:w16se="http://schemas.microsoft.com/office/word/2015/wordml/symex" xmlns:wpg="http://schemas.microsoft.com/office/word/2010/wordprocessingGroup" xmlns:wpi="http://schemas.microsoft.com/office/word/2010/wordprocessingInk" xmlns:wne="http://schemas.microsoft.com/office/word/2006/wordml" xmlns:wps="http://schemas.microsoft.com/office/word/2010/wordprocessingShape" mc:Ignorable="w14 w15 w16se w16cid w16 w16cex w16sdtdh w16sdtfl w16du wp14">
+<w:endnotes xmlns:wpc="http://schemas.microsoft.com/office/word/2010/wordprocessingCanvas" xmlns:cx="http://schemas.microsoft.com/office/drawing/2014/chartex" xmlns:cx1="http://schemas.microsoft.com/office/drawing/2015/9/8/chartex" xmlns:cx2="http://schemas.microsoft.com/office/drawing/2015/10/21/chartex" xmlns:cx3="http://schemas.microsoft.com/office/drawing/2016/5/9/chartex" xmlns:cx4="http://schemas.microsoft.com/office/drawing/2016/5/10/chartex" xmlns:cx5="http://schemas.microsoft.com/office/drawing/2016/5/11/chartex" xmlns:cx6="http://schemas.microsoft.com/office/drawing/2016/5/12/chartex" xmlns:cx7="http://schemas.microsoft.com/office/drawing/2016/5/13/chartex" xmlns:cx8="http://schemas.microsoft.com/office/drawing/2016/5/14/chartex" xmlns:mc="http://schemas.openxmlformats.org/markup-compatibility/2006" xmlns:aink="http://schemas.microsoft.com/office/drawing/2016/ink" xmlns:am3d="http://schemas.microsoft.com/office/drawing/2017/model3d" xmlns:o="urn:schemas-microsoft-com:office:office" xmlns:oel="http://schemas.microsoft.com/office/2019/extlst" xmlns:r="http://schemas.openxmlformats.org/officeDocument/2006/relationships" xmlns:m="http://schemas.openxmlformats.org/officeDocument/2006/math" xmlns:v="urn:schemas-microsoft-com:vml" xmlns:wp14="http://schemas.microsoft.com/office/word/2010/wordprocessingDrawing" xmlns:wp="http://schemas.openxmlformats.org/drawingml/2006/wordprocessingDrawing" xmlns:w10="urn:schemas-microsoft-com:office:word" xmlns:w="http://schemas.openxmlformats.org/wordprocessingml/2006/main" xmlns:w14="http://schemas.microsoft.com/office/word/2010/wordml" xmlns:w15="http://schemas.microsoft.com/office/word/2012/wordml" xmlns:w16cex="http://schemas.microsoft.com/office/word/2018/wordml/cex" xmlns:w16cid="http://schemas.microsoft.com/office/word/2016/wordml/cid" xmlns:w16="http://schemas.microsoft.com/office/word/2018/wordml" xmlns:w16du="http://schemas.microsoft.com/office/word/2023/wordml/word16du" xmlns:w16sdtdh="http://schemas.microsoft.com/office/word/2020/wordml/sdtdatahash" xmlns:w16sdtfl="http://schemas.microsoft.com/office/word/2024/wordml/sdtformatlock" xmlns:w16se="http://schemas.microsoft.com/office/word/2015/wordml/symex" xmlns:wpg="http://schemas.microsoft.com/office/word/2010/wordprocessingGroup" xmlns:wpi="http://schemas.microsoft.com/office/word/2010/wordprocessingInk" xmlns:wne="http://schemas.microsoft.com/office/word/2006/wordml" xmlns:wps="http://schemas.microsoft.com/office/word/2010/wordprocessingShape" mc:Ignorable="w14 w15 w16se w16cid w16 w16cex w16sdtdh w16sdtfl w16du wp14">
   <w:endnote w:type="separator" w:id="-1">
     <w:p>
       <w:pPr>
@@ -5973,7 +6490,7 @@
 </file>
 
 <file path=word/footnotes.xml><?xml version="1.0" encoding="utf-8"?>
-<w:footnotes xmlns:wpc="http://schemas.microsoft.com/office/word/2010/wordprocessingCanvas" xmlns:cx="http://schemas.microsoft.com/office/drawing/2014/chartex" xmlns:cx1="http://schemas.microsoft.com/office/drawing/2015/9/8/chartex" xmlns:cx2="http://schemas.microsoft.com/office/drawing/2015/10/21/chartex" xmlns:cx3="http://schemas.microsoft.com/office/drawing/2016/5/9/chartex" xmlns:cx4="http://schemas.microsoft.com/office/drawing/2016/5/10/chartex" xmlns:cx5="http://schemas.microsoft.com/office/drawing/2016/5/11/chartex" xmlns:cx6="http://schemas.microsoft.com/office/drawing/2016/5/12/chartex" xmlns:cx7="http://schemas.microsoft.com/office/drawing/2016/5/13/chartex" xmlns:cx8="http://schemas.microsoft.com/office/drawing/2016/5/14/chartex" xmlns:mc="http://schemas.openxmlformats.org/markup-compatibility/2006" xmlns:aink="http://schemas.microsoft.com/office/drawing/2016/ink" xmlns:am3d="http://schemas.microsoft.com/office/drawing/2017/model3d" xmlns:o="urn:schemas-microsoft-com:office:office" xmlns:oel="http://schemas.microsoft.com/office/2019/extlst" xmlns:r="http://schemas.openxmlformats.org/officeDocument/2006/relationships" xmlns:m="http://schemas.openxmlformats.org/officeDocument/2006/math" xmlns:v="urn:schemas-microsoft-com:vml" xmlns:wp14="http://schemas.microsoft.com/office/word/2010/wordprocessingDrawing" xmlns:wp="http://schemas.openxmlformats.org/drawingml/2006/wordprocessingDrawing" xmlns:w10="urn:schemas-microsoft-com:office:word" xmlns:w="http://schemas.openxmlformats.org/wordprocessingml/2006/main" xmlns:w14="http://schemas.microsoft.com/office/word/2010/wordml" xmlns:w15="http://schemas.microsoft.com/office/word/2012/wordml" xmlns:w16cei="http://schemas.microsoft.com/office/word/2026/wordml/cei" xmlns:w16cex="http://schemas.microsoft.com/office/word/2018/wordml/cex" xmlns:w16cid="http://schemas.microsoft.com/office/word/2016/wordml/cid" xmlns:w16="http://schemas.microsoft.com/office/word/2018/wordml" xmlns:w16du="http://schemas.microsoft.com/office/word/2023/wordml/word16du" xmlns:w16sdtdh="http://schemas.microsoft.com/office/word/2020/wordml/sdtdatahash" xmlns:w16sdtfl="http://schemas.microsoft.com/office/word/2024/wordml/sdtformatlock" xmlns:w16se="http://schemas.microsoft.com/office/word/2015/wordml/symex" xmlns:wpg="http://schemas.microsoft.com/office/word/2010/wordprocessingGroup" xmlns:wpi="http://schemas.microsoft.com/office/word/2010/wordprocessingInk" xmlns:wne="http://schemas.microsoft.com/office/word/2006/wordml" xmlns:wps="http://schemas.microsoft.com/office/word/2010/wordprocessingShape" mc:Ignorable="w14 w15 w16se w16cid w16 w16cex w16sdtdh w16sdtfl w16du wp14">
+<w:footnotes xmlns:wpc="http://schemas.microsoft.com/office/word/2010/wordprocessingCanvas" xmlns:cx="http://schemas.microsoft.com/office/drawing/2014/chartex" xmlns:cx1="http://schemas.microsoft.com/office/drawing/2015/9/8/chartex" xmlns:cx2="http://schemas.microsoft.com/office/drawing/2015/10/21/chartex" xmlns:cx3="http://schemas.microsoft.com/office/drawing/2016/5/9/chartex" xmlns:cx4="http://schemas.microsoft.com/office/drawing/2016/5/10/chartex" xmlns:cx5="http://schemas.microsoft.com/office/drawing/2016/5/11/chartex" xmlns:cx6="http://schemas.microsoft.com/office/drawing/2016/5/12/chartex" xmlns:cx7="http://schemas.microsoft.com/office/drawing/2016/5/13/chartex" xmlns:cx8="http://schemas.microsoft.com/office/drawing/2016/5/14/chartex" xmlns:mc="http://schemas.openxmlformats.org/markup-compatibility/2006" xmlns:aink="http://schemas.microsoft.com/office/drawing/2016/ink" xmlns:am3d="http://schemas.microsoft.com/office/drawing/2017/model3d" xmlns:o="urn:schemas-microsoft-com:office:office" xmlns:oel="http://schemas.microsoft.com/office/2019/extlst" xmlns:r="http://schemas.openxmlformats.org/officeDocument/2006/relationships" xmlns:m="http://schemas.openxmlformats.org/officeDocument/2006/math" xmlns:v="urn:schemas-microsoft-com:vml" xmlns:wp14="http://schemas.microsoft.com/office/word/2010/wordprocessingDrawing" xmlns:wp="http://schemas.openxmlformats.org/drawingml/2006/wordprocessingDrawing" xmlns:w10="urn:schemas-microsoft-com:office:word" xmlns:w="http://schemas.openxmlformats.org/wordprocessingml/2006/main" xmlns:w14="http://schemas.microsoft.com/office/word/2010/wordml" xmlns:w15="http://schemas.microsoft.com/office/word/2012/wordml" xmlns:w16cex="http://schemas.microsoft.com/office/word/2018/wordml/cex" xmlns:w16cid="http://schemas.microsoft.com/office/word/2016/wordml/cid" xmlns:w16="http://schemas.microsoft.com/office/word/2018/wordml" xmlns:w16du="http://schemas.microsoft.com/office/word/2023/wordml/word16du" xmlns:w16sdtdh="http://schemas.microsoft.com/office/word/2020/wordml/sdtdatahash" xmlns:w16sdtfl="http://schemas.microsoft.com/office/word/2024/wordml/sdtformatlock" xmlns:w16se="http://schemas.microsoft.com/office/word/2015/wordml/symex" xmlns:wpg="http://schemas.microsoft.com/office/word/2010/wordprocessingGroup" xmlns:wpi="http://schemas.microsoft.com/office/word/2010/wordprocessingInk" xmlns:wne="http://schemas.microsoft.com/office/word/2006/wordml" xmlns:wps="http://schemas.microsoft.com/office/word/2010/wordprocessingShape" mc:Ignorable="w14 w15 w16se w16cid w16 w16cex w16sdtdh w16sdtfl w16du wp14">
   <w:footnote w:type="separator" w:id="-1">
     <w:p>
       <w:pPr>
@@ -6424,11 +6941,60 @@
       </w:sdt>
     </w:p>
   </w:footnote>
+  <w:footnote w:id="11">
+    <w:p>
+      <w:pPr>
+        <w:pStyle w:val="FootnoteText"/>
+        <w:rPr>
+          <w:lang w:val="en-US"/>
+        </w:rPr>
+      </w:pPr>
+      <w:r>
+        <w:rPr>
+          <w:rStyle w:val="FootnoteReference"/>
+        </w:rPr>
+        <w:footnoteRef/>
+      </w:r>
+      <w:r>
+        <w:t xml:space="preserve"> </w:t>
+      </w:r>
+      <w:sdt>
+        <w:sdtPr>
+          <w:id w:val="1236903332"/>
+          <w:citation/>
+        </w:sdtPr>
+        <w:sdtContent>
+          <w:r>
+            <w:fldChar w:fldCharType="begin"/>
+          </w:r>
+          <w:r>
+            <w:rPr>
+              <w:lang w:val="en-US"/>
+            </w:rPr>
+            <w:instrText xml:space="preserve">CITATION Tar \n  \y  \l 1033 </w:instrText>
+          </w:r>
+          <w:r>
+            <w:fldChar w:fldCharType="separate"/>
+          </w:r>
+          <w:r>
+            <w:rPr>
+              <w:noProof/>
+              <w:lang w:val="en-US"/>
+            </w:rPr>
+            <w:t>(Major Arcana Meanings)</w:t>
+          </w:r>
+          <w:r>
+            <w:fldChar w:fldCharType="end"/>
+          </w:r>
+        </w:sdtContent>
+      </w:sdt>
+    </w:p>
+  </w:footnote>
 </w:footnotes>
 </file>
 
 <file path=word/numbering.xml><?xml version="1.0" encoding="utf-8"?>
-<w:numbering xmlns:wpc="http://schemas.microsoft.com/office/word/2010/wordprocessingCanvas" xmlns:cx="http://schemas.microsoft.com/office/drawing/2014/chartex" xmlns:cx1="http://schemas.microsoft.com/office/drawing/2015/9/8/chartex" xmlns:cx2="http://schemas.microsoft.com/office/drawing/2015/10/21/chartex" xmlns:cx3="http://schemas.microsoft.com/office/drawing/2016/5/9/chartex" xmlns:cx4="http://schemas.microsoft.com/office/drawing/2016/5/10/chartex" xmlns:cx5="http://schemas.microsoft.com/office/drawing/2016/5/11/chartex" xmlns:cx6="http://schemas.microsoft.com/office/drawing/2016/5/12/chartex" xmlns:cx7="http://schemas.microsoft.com/office/drawing/2016/5/13/chartex" xmlns:cx8="http://schemas.microsoft.com/office/drawing/2016/5/14/chartex" xmlns:mc="http://schemas.openxmlformats.org/markup-compatibility/2006" xmlns:aink="http://schemas.microsoft.com/office/drawing/2016/ink" xmlns:am3d="http://schemas.microsoft.com/office/drawing/2017/model3d" xmlns:o="urn:schemas-microsoft-com:office:office" xmlns:oel="http://schemas.microsoft.com/office/2019/extlst" xmlns:r="http://schemas.openxmlformats.org/officeDocument/2006/relationships" xmlns:m="http://schemas.openxmlformats.org/officeDocument/2006/math" xmlns:v="urn:schemas-microsoft-com:vml" xmlns:wp14="http://schemas.microsoft.com/office/word/2010/wordprocessingDrawing" xmlns:wp="http://schemas.openxmlformats.org/drawingml/2006/wordprocessingDrawing" xmlns:w10="urn:schemas-microsoft-com:office:word" xmlns:w="http://schemas.openxmlformats.org/wordprocessingml/2006/main" xmlns:w14="http://schemas.microsoft.com/office/word/2010/wordml" xmlns:w15="http://schemas.microsoft.com/office/word/2012/wordml" xmlns:w16cei="http://schemas.microsoft.com/office/word/2026/wordml/cei" xmlns:w16cex="http://schemas.microsoft.com/office/word/2018/wordml/cex" xmlns:w16cid="http://schemas.microsoft.com/office/word/2016/wordml/cid" xmlns:w16="http://schemas.microsoft.com/office/word/2018/wordml" xmlns:w16du="http://schemas.microsoft.com/office/word/2023/wordml/word16du" xmlns:w16sdtdh="http://schemas.microsoft.com/office/word/2020/wordml/sdtdatahash" xmlns:w16sdtfl="http://schemas.microsoft.com/office/word/2024/wordml/sdtformatlock" xmlns:w16se="http://schemas.microsoft.com/office/word/2015/wordml/symex" xmlns:wpg="http://schemas.microsoft.com/office/word/2010/wordprocessingGroup" xmlns:wpi="http://schemas.microsoft.com/office/word/2010/wordprocessingInk" xmlns:wne="http://schemas.microsoft.com/office/word/2006/wordml" xmlns:wps="http://schemas.microsoft.com/office/word/2010/wordprocessingShape" mc:Ignorable="w14 w15 w16se w16cid w16 w16cex w16sdtdh w16sdtfl w16du wp14">
+<w:numbering xmlns:wpc="http://schemas.microsoft.com/office/word/2010/wordprocessingCanvas" xmlns:cx="http://schemas.microsoft.com/office/drawing/2014/chartex" xmlns:cx1="http://schemas.microsoft.com/office/drawing/2015/9/8/chartex" xmlns:cx2="http://schemas.microsoft.com/office/drawing/2015/10/21/chartex" xmlns:cx3="http://schemas.microsoft.com/office/drawing/2016/5/9/chartex" xmlns:cx4="http://schemas.microsoft.com/office/drawing/2016/5/10/chartex" xmlns:cx5="http://schemas.microsoft.com/office/drawing/2016/5/11/chartex" xmlns:cx6="http://schemas.microsoft.com/office/drawing/2016/5/12/chartex" xmlns:cx7="http://schemas.microsoft.com/office/drawing/2016/5/13/chartex" xmlns:cx8="http://schemas.microsoft.com/office/drawing/2016/5/14/chartex" xmlns:mc="http://schemas.openxmlformats.org/markup-compatibility/2006" xmlns:aink="http://schemas.microsoft.com/office/drawing/2016/ink" xmlns:am3d="http://schemas.microsoft.com/office/drawing/2017/model3d" xmlns:o="urn:schemas-microsoft-com:office:office" xmlns:oel="http://schemas.microsoft.com/office/2019/extlst" xmlns:r="http://schemas.openxmlformats.org/officeDocument/2006/relationships" xmlns:m="http://schemas.openxmlformats.org/officeDocument/2006/math" xmlns:v="urn:schemas-microsoft-com:vml" xmlns:wp14="http://schemas.microsoft.com/office/word/2010/wordprocessingDrawing" xmlns:wp="http://schemas.openxmlformats.org/drawingml/2006/wordprocessingDrawing" xmlns:w10="urn:schemas-microsoft-com:office:word" xmlns:w="http://schemas.openxmlformats.org/wordprocessingml/2006/main" xmlns:w14="http://schemas.microsoft.com/office/word/2010/wordml" xmlns:w15="http://schemas.microsoft.com/office/word/2012/wordml" xmlns:w16cex="http://schemas.microsoft.com/office/word/2018/wordml/cex" xmlns:w16cid="http://schemas.microsoft.com/office/word/2016/wordml/cid" xmlns:w16="http://schemas.microsoft.com/office/word/2018/wordml" xmlns:w16du="http://schemas.microsoft.com/office/word/2023/wordml/word16du" xmlns:w16sdtdh="http://schemas.microsoft.com/office/word/2020/wordml/sdtdatahash" xmlns:w16sdtfl="http://schemas.microsoft.com/office/word/2024/wordml/sdtformatlock" xmlns:w16se="http://schemas.microsoft.com/office/word/2015/wordml/symex" xmlns:wpg="http://schemas.microsoft.com/office/word/2010/wordprocessingGroup" xmlns:wpi="http://schemas.microsoft.com/office/word/2010/wordprocessingInk" xmlns:wne="http://schemas.microsoft.com/office/word/2006/wordml" xmlns:wps="http://schemas.microsoft.com/office/word/2010/wordprocessingShape" mc:Ignorable="w14 w15 w16se w16cid w16 w16cex w16sdtdh w16sdtfl w16du wp14">
   <w:numPicBullet w:numPicBulletId="0">
     <w:pict>
       <v:shapetype id="_x0000_t75" coordsize="21600,21600" o:spt="75" o:preferrelative="t" path="m@4@5l@4@11@9@11@9@5xe" filled="f" stroked="f">
@@ -6450,12 +7016,186 @@
         <v:path o:extrusionok="f" gradientshapeok="t" o:connecttype="rect"/>
         <o:lock v:ext="edit" aspectratio="t"/>
       </v:shapetype>
-      <v:shape id="Graphic 1" o:spid="_x0000_i1025" type="#_x0000_t75" alt="Checkmark with solid fill" style="width:13.5pt;height:11.25pt;visibility:visible" o:gfxdata="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" o:bullet="t">
+      <v:shape id="Graphic 1" o:spid="_x0000_i1025" type="#_x0000_t75" alt="Checkmark with solid fill" style="width:14.4pt;height:14.4pt;visibility:visible" o:gfxdata="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" o:bullet="t">
         <v:imagedata r:id="rId1" o:title="" croptop="-5390f" cropbottom="-6525f" cropright="-975f"/>
       </v:shape>
     </w:pict>
   </w:numPicBullet>
   <w:abstractNum w:abstractNumId="0" w15:restartNumberingAfterBreak="0">
+    <w:nsid w:val="0BBA1827"/>
+    <w:multiLevelType w:val="hybridMultilevel"/>
+    <w:tmpl w:val="9AFAEA9A"/>
+    <w:lvl w:ilvl="0" w:tplc="0809000F">
+      <w:start w:val="1"/>
+      <w:numFmt w:val="decimal"/>
+      <w:lvlText w:val="%1."/>
+      <w:lvlJc w:val="left"/>
+      <w:pPr>
+        <w:ind w:left="720" w:hanging="360"/>
+      </w:pPr>
+    </w:lvl>
+    <w:lvl w:ilvl="1" w:tplc="08090019" w:tentative="1">
+      <w:start w:val="1"/>
+      <w:numFmt w:val="lowerLetter"/>
+      <w:lvlText w:val="%2."/>
+      <w:lvlJc w:val="left"/>
+      <w:pPr>
+        <w:ind w:left="1440" w:hanging="360"/>
+      </w:pPr>
+    </w:lvl>
+    <w:lvl w:ilvl="2" w:tplc="0809001B" w:tentative="1">
+      <w:start w:val="1"/>
+      <w:numFmt w:val="lowerRoman"/>
+      <w:lvlText w:val="%3."/>
+      <w:lvlJc w:val="right"/>
+      <w:pPr>
+        <w:ind w:left="2160" w:hanging="180"/>
+      </w:pPr>
+    </w:lvl>
+    <w:lvl w:ilvl="3" w:tplc="0809000F" w:tentative="1">
+      <w:start w:val="1"/>
+      <w:numFmt w:val="decimal"/>
+      <w:lvlText w:val="%4."/>
+      <w:lvlJc w:val="left"/>
+      <w:pPr>
+        <w:ind w:left="2880" w:hanging="360"/>
+      </w:pPr>
+    </w:lvl>
+    <w:lvl w:ilvl="4" w:tplc="08090019" w:tentative="1">
+      <w:start w:val="1"/>
+      <w:numFmt w:val="lowerLetter"/>
+      <w:lvlText w:val="%5."/>
+      <w:lvlJc w:val="left"/>
+      <w:pPr>
+        <w:ind w:left="3600" w:hanging="360"/>
+      </w:pPr>
+    </w:lvl>
+    <w:lvl w:ilvl="5" w:tplc="0809001B" w:tentative="1">
+      <w:start w:val="1"/>
+      <w:numFmt w:val="lowerRoman"/>
+      <w:lvlText w:val="%6."/>
+      <w:lvlJc w:val="right"/>
+      <w:pPr>
+        <w:ind w:left="4320" w:hanging="180"/>
+      </w:pPr>
+    </w:lvl>
+    <w:lvl w:ilvl="6" w:tplc="0809000F" w:tentative="1">
+      <w:start w:val="1"/>
+      <w:numFmt w:val="decimal"/>
+      <w:lvlText w:val="%7."/>
+      <w:lvlJc w:val="left"/>
+      <w:pPr>
+        <w:ind w:left="5040" w:hanging="360"/>
+      </w:pPr>
+    </w:lvl>
+    <w:lvl w:ilvl="7" w:tplc="08090019" w:tentative="1">
+      <w:start w:val="1"/>
+      <w:numFmt w:val="lowerLetter"/>
+      <w:lvlText w:val="%8."/>
+      <w:lvlJc w:val="left"/>
+      <w:pPr>
+        <w:ind w:left="5760" w:hanging="360"/>
+      </w:pPr>
+    </w:lvl>
+    <w:lvl w:ilvl="8" w:tplc="0809001B" w:tentative="1">
+      <w:start w:val="1"/>
+      <w:numFmt w:val="lowerRoman"/>
+      <w:lvlText w:val="%9."/>
+      <w:lvlJc w:val="right"/>
+      <w:pPr>
+        <w:ind w:left="6480" w:hanging="180"/>
+      </w:pPr>
+    </w:lvl>
+  </w:abstractNum>
+  <w:abstractNum w:abstractNumId="1" w15:restartNumberingAfterBreak="0">
+    <w:nsid w:val="13211F90"/>
+    <w:multiLevelType w:val="hybridMultilevel"/>
+    <w:tmpl w:val="C2DAD3B0"/>
+    <w:lvl w:ilvl="0" w:tplc="6B9CC2FC">
+      <w:numFmt w:val="decimal"/>
+      <w:lvlText w:val="%1."/>
+      <w:lvlJc w:val="left"/>
+      <w:pPr>
+        <w:ind w:left="1080" w:hanging="360"/>
+      </w:pPr>
+      <w:rPr>
+        <w:rFonts w:hint="default"/>
+      </w:rPr>
+    </w:lvl>
+    <w:lvl w:ilvl="1" w:tplc="08090019">
+      <w:start w:val="1"/>
+      <w:numFmt w:val="lowerLetter"/>
+      <w:lvlText w:val="%2."/>
+      <w:lvlJc w:val="left"/>
+      <w:pPr>
+        <w:ind w:left="1800" w:hanging="360"/>
+      </w:pPr>
+    </w:lvl>
+    <w:lvl w:ilvl="2" w:tplc="0809001B" w:tentative="1">
+      <w:start w:val="1"/>
+      <w:numFmt w:val="lowerRoman"/>
+      <w:lvlText w:val="%3."/>
+      <w:lvlJc w:val="right"/>
+      <w:pPr>
+        <w:ind w:left="2520" w:hanging="180"/>
+      </w:pPr>
+    </w:lvl>
+    <w:lvl w:ilvl="3" w:tplc="0809000F" w:tentative="1">
+      <w:start w:val="1"/>
+      <w:numFmt w:val="decimal"/>
+      <w:lvlText w:val="%4."/>
+      <w:lvlJc w:val="left"/>
+      <w:pPr>
+        <w:ind w:left="3240" w:hanging="360"/>
+      </w:pPr>
+    </w:lvl>
+    <w:lvl w:ilvl="4" w:tplc="08090019" w:tentative="1">
+      <w:start w:val="1"/>
+      <w:numFmt w:val="lowerLetter"/>
+      <w:lvlText w:val="%5."/>
+      <w:lvlJc w:val="left"/>
+      <w:pPr>
+        <w:ind w:left="3960" w:hanging="360"/>
+      </w:pPr>
+    </w:lvl>
+    <w:lvl w:ilvl="5" w:tplc="0809001B" w:tentative="1">
+      <w:start w:val="1"/>
+      <w:numFmt w:val="lowerRoman"/>
+      <w:lvlText w:val="%6."/>
+      <w:lvlJc w:val="right"/>
+      <w:pPr>
+        <w:ind w:left="4680" w:hanging="180"/>
+      </w:pPr>
+    </w:lvl>
+    <w:lvl w:ilvl="6" w:tplc="0809000F" w:tentative="1">
+      <w:start w:val="1"/>
+      <w:numFmt w:val="decimal"/>
+      <w:lvlText w:val="%7."/>
+      <w:lvlJc w:val="left"/>
+      <w:pPr>
+        <w:ind w:left="5400" w:hanging="360"/>
+      </w:pPr>
+    </w:lvl>
+    <w:lvl w:ilvl="7" w:tplc="08090019" w:tentative="1">
+      <w:start w:val="1"/>
+      <w:numFmt w:val="lowerLetter"/>
+      <w:lvlText w:val="%8."/>
+      <w:lvlJc w:val="left"/>
+      <w:pPr>
+        <w:ind w:left="6120" w:hanging="360"/>
+      </w:pPr>
+    </w:lvl>
+    <w:lvl w:ilvl="8" w:tplc="0809001B" w:tentative="1">
+      <w:start w:val="1"/>
+      <w:numFmt w:val="lowerRoman"/>
+      <w:lvlText w:val="%9."/>
+      <w:lvlJc w:val="right"/>
+      <w:pPr>
+        <w:ind w:left="6840" w:hanging="180"/>
+      </w:pPr>
+    </w:lvl>
+  </w:abstractNum>
+  <w:abstractNum w:abstractNumId="2" w15:restartNumberingAfterBreak="0">
     <w:nsid w:val="1E7C21FA"/>
     <w:multiLevelType w:val="hybridMultilevel"/>
     <w:tmpl w:val="32D68504"/>
@@ -6568,7 +7308,7 @@
       </w:rPr>
     </w:lvl>
   </w:abstractNum>
-  <w:abstractNum w:abstractNumId="1" w15:restartNumberingAfterBreak="0">
+  <w:abstractNum w:abstractNumId="3" w15:restartNumberingAfterBreak="0">
     <w:nsid w:val="22665819"/>
     <w:multiLevelType w:val="hybridMultilevel"/>
     <w:tmpl w:val="1B26D6CA"/>
@@ -6681,7 +7421,7 @@
       </w:rPr>
     </w:lvl>
   </w:abstractNum>
-  <w:abstractNum w:abstractNumId="2" w15:restartNumberingAfterBreak="0">
+  <w:abstractNum w:abstractNumId="4" w15:restartNumberingAfterBreak="0">
     <w:nsid w:val="2F143DE8"/>
     <w:multiLevelType w:val="hybridMultilevel"/>
     <w:tmpl w:val="5BC06A7C"/>
@@ -6794,7 +7534,96 @@
       </w:rPr>
     </w:lvl>
   </w:abstractNum>
-  <w:abstractNum w:abstractNumId="3" w15:restartNumberingAfterBreak="0">
+  <w:abstractNum w:abstractNumId="5" w15:restartNumberingAfterBreak="0">
+    <w:nsid w:val="468F0F0F"/>
+    <w:multiLevelType w:val="hybridMultilevel"/>
+    <w:tmpl w:val="E2104112"/>
+    <w:lvl w:ilvl="0" w:tplc="9C82C870">
+      <w:start w:val="1"/>
+      <w:numFmt w:val="upperRoman"/>
+      <w:lvlText w:val="%1."/>
+      <w:lvlJc w:val="left"/>
+      <w:pPr>
+        <w:ind w:left="1440" w:hanging="720"/>
+      </w:pPr>
+      <w:rPr>
+        <w:rFonts w:hint="default"/>
+      </w:rPr>
+    </w:lvl>
+    <w:lvl w:ilvl="1" w:tplc="08090019">
+      <w:start w:val="1"/>
+      <w:numFmt w:val="lowerLetter"/>
+      <w:lvlText w:val="%2."/>
+      <w:lvlJc w:val="left"/>
+      <w:pPr>
+        <w:ind w:left="1800" w:hanging="360"/>
+      </w:pPr>
+    </w:lvl>
+    <w:lvl w:ilvl="2" w:tplc="0809001B" w:tentative="1">
+      <w:start w:val="1"/>
+      <w:numFmt w:val="lowerRoman"/>
+      <w:lvlText w:val="%3."/>
+      <w:lvlJc w:val="right"/>
+      <w:pPr>
+        <w:ind w:left="2520" w:hanging="180"/>
+      </w:pPr>
+    </w:lvl>
+    <w:lvl w:ilvl="3" w:tplc="0809000F" w:tentative="1">
+      <w:start w:val="1"/>
+      <w:numFmt w:val="decimal"/>
+      <w:lvlText w:val="%4."/>
+      <w:lvlJc w:val="left"/>
+      <w:pPr>
+        <w:ind w:left="3240" w:hanging="360"/>
+      </w:pPr>
+    </w:lvl>
+    <w:lvl w:ilvl="4" w:tplc="08090019" w:tentative="1">
+      <w:start w:val="1"/>
+      <w:numFmt w:val="lowerLetter"/>
+      <w:lvlText w:val="%5."/>
+      <w:lvlJc w:val="left"/>
+      <w:pPr>
+        <w:ind w:left="3960" w:hanging="360"/>
+      </w:pPr>
+    </w:lvl>
+    <w:lvl w:ilvl="5" w:tplc="0809001B" w:tentative="1">
+      <w:start w:val="1"/>
+      <w:numFmt w:val="lowerRoman"/>
+      <w:lvlText w:val="%6."/>
+      <w:lvlJc w:val="right"/>
+      <w:pPr>
+        <w:ind w:left="4680" w:hanging="180"/>
+      </w:pPr>
+    </w:lvl>
+    <w:lvl w:ilvl="6" w:tplc="0809000F" w:tentative="1">
+      <w:start w:val="1"/>
+      <w:numFmt w:val="decimal"/>
+      <w:lvlText w:val="%7."/>
+      <w:lvlJc w:val="left"/>
+      <w:pPr>
+        <w:ind w:left="5400" w:hanging="360"/>
+      </w:pPr>
+    </w:lvl>
+    <w:lvl w:ilvl="7" w:tplc="08090019" w:tentative="1">
+      <w:start w:val="1"/>
+      <w:numFmt w:val="lowerLetter"/>
+      <w:lvlText w:val="%8."/>
+      <w:lvlJc w:val="left"/>
+      <w:pPr>
+        <w:ind w:left="6120" w:hanging="360"/>
+      </w:pPr>
+    </w:lvl>
+    <w:lvl w:ilvl="8" w:tplc="0809001B" w:tentative="1">
+      <w:start w:val="1"/>
+      <w:numFmt w:val="lowerRoman"/>
+      <w:lvlText w:val="%9."/>
+      <w:lvlJc w:val="right"/>
+      <w:pPr>
+        <w:ind w:left="6840" w:hanging="180"/>
+      </w:pPr>
+    </w:lvl>
+  </w:abstractNum>
+  <w:abstractNum w:abstractNumId="6" w15:restartNumberingAfterBreak="0">
     <w:nsid w:val="47461B7A"/>
     <w:multiLevelType w:val="hybridMultilevel"/>
     <w:tmpl w:val="877E9488"/>
@@ -6822,7 +7651,7 @@
         <w:rFonts w:ascii="Courier New" w:hAnsi="Courier New" w:cs="Courier New" w:hint="default"/>
       </w:rPr>
     </w:lvl>
-    <w:lvl w:ilvl="2" w:tplc="08090005" w:tentative="1">
+    <w:lvl w:ilvl="2" w:tplc="08090005">
       <w:start w:val="1"/>
       <w:numFmt w:val="bullet"/>
       <w:lvlText w:val=""/>
@@ -6907,7 +7736,7 @@
       </w:rPr>
     </w:lvl>
   </w:abstractNum>
-  <w:abstractNum w:abstractNumId="4" w15:restartNumberingAfterBreak="0">
+  <w:abstractNum w:abstractNumId="7" w15:restartNumberingAfterBreak="0">
     <w:nsid w:val="4C580607"/>
     <w:multiLevelType w:val="hybridMultilevel"/>
     <w:tmpl w:val="E2F6A304"/>
@@ -7020,7 +7849,7 @@
       </w:rPr>
     </w:lvl>
   </w:abstractNum>
-  <w:abstractNum w:abstractNumId="5" w15:restartNumberingAfterBreak="0">
+  <w:abstractNum w:abstractNumId="8" w15:restartNumberingAfterBreak="0">
     <w:nsid w:val="657C7FC2"/>
     <w:multiLevelType w:val="hybridMultilevel"/>
     <w:tmpl w:val="12DAAC6E"/>
@@ -7109,7 +7938,7 @@
       </w:pPr>
     </w:lvl>
   </w:abstractNum>
-  <w:abstractNum w:abstractNumId="6" w15:restartNumberingAfterBreak="0">
+  <w:abstractNum w:abstractNumId="9" w15:restartNumberingAfterBreak="0">
     <w:nsid w:val="7B5412AB"/>
     <w:multiLevelType w:val="hybridMultilevel"/>
     <w:tmpl w:val="3544C1D6"/>
@@ -7223,25 +8052,34 @@
     </w:lvl>
   </w:abstractNum>
   <w:num w:numId="1" w16cid:durableId="1149322547">
-    <w:abstractNumId w:val="5"/>
+    <w:abstractNumId w:val="8"/>
   </w:num>
   <w:num w:numId="2" w16cid:durableId="355884517">
+    <w:abstractNumId w:val="6"/>
+  </w:num>
+  <w:num w:numId="3" w16cid:durableId="1272736122">
+    <w:abstractNumId w:val="4"/>
+  </w:num>
+  <w:num w:numId="4" w16cid:durableId="645547491">
+    <w:abstractNumId w:val="7"/>
+  </w:num>
+  <w:num w:numId="5" w16cid:durableId="876357875">
     <w:abstractNumId w:val="3"/>
   </w:num>
-  <w:num w:numId="3" w16cid:durableId="1272736122">
+  <w:num w:numId="6" w16cid:durableId="714741481">
     <w:abstractNumId w:val="2"/>
   </w:num>
-  <w:num w:numId="4" w16cid:durableId="645547491">
-    <w:abstractNumId w:val="4"/>
+  <w:num w:numId="7" w16cid:durableId="1817867448">
+    <w:abstractNumId w:val="9"/>
   </w:num>
-  <w:num w:numId="5" w16cid:durableId="876357875">
+  <w:num w:numId="8" w16cid:durableId="182911285">
+    <w:abstractNumId w:val="0"/>
+  </w:num>
+  <w:num w:numId="9" w16cid:durableId="1443263837">
     <w:abstractNumId w:val="1"/>
   </w:num>
-  <w:num w:numId="6" w16cid:durableId="714741481">
-    <w:abstractNumId w:val="0"/>
-  </w:num>
-  <w:num w:numId="7" w16cid:durableId="1817867448">
-    <w:abstractNumId w:val="6"/>
+  <w:num w:numId="10" w16cid:durableId="1292786634">
+    <w:abstractNumId w:val="5"/>
   </w:num>
 </w:numbering>
 </file>
@@ -7846,7 +8684,6 @@
   <w:style w:type="character" w:default="1" w:styleId="DefaultParagraphFont">
     <w:name w:val="Default Paragraph Font"/>
     <w:uiPriority w:val="1"/>
-    <w:semiHidden/>
     <w:unhideWhenUsed/>
   </w:style>
   <w:style w:type="table" w:default="1" w:styleId="TableNormal">
@@ -8648,14 +9485,6 @@
 </file>
 
 <file path=customXml/item1.xml><?xml version="1.0" encoding="utf-8"?>
-<p:properties xmlns:p="http://schemas.microsoft.com/office/2006/metadata/properties" xmlns:xsi="http://www.w3.org/2001/XMLSchema-instance" xmlns:pc="http://schemas.microsoft.com/office/infopath/2007/PartnerControls">
-  <documentManagement>
-    <_activity xmlns="bf3b6886-11cb-4b34-846a-332f0895a374" xsi:nil="true"/>
-  </documentManagement>
-</p:properties>
-</file>
-
-<file path=customXml/item2.xml><?xml version="1.0" encoding="utf-8"?>
 <?mso-contentType ?>
 <FormTemplates xmlns="http://schemas.microsoft.com/sharepoint/v3/contenttype/forms">
   <Display>DocumentLibraryForm</Display>
@@ -8664,137 +9493,15 @@
 </FormTemplates>
 </file>
 
-<file path=customXml/item3.xml><?xml version="1.0" encoding="utf-8"?>
-<b:Sources xmlns:b="http://schemas.openxmlformats.org/officeDocument/2006/bibliography" xmlns="http://schemas.openxmlformats.org/officeDocument/2006/bibliography" SelectedStyle="\APASixthEditionOfficeOnline.xsl" StyleName="APA" Version="6">
-  <b:Source>
-    <b:Tag>Dea17</b:Tag>
-    <b:SourceType>Misc</b:SourceType>
-    <b:Guid>{3C6C118D-AEE6-44A9-AAEC-7FFCD6D9849B}</b:Guid>
-    <b:Title>Dead Cells</b:Title>
-    <b:Year>2017</b:Year>
-    <b:Publisher>Motion Twin</b:Publisher>
-    <b:Month>May</b:Month>
-    <b:Day>10</b:Day>
-    <b:RefOrder>1</b:RefOrder>
-  </b:Source>
-  <b:Source>
-    <b:Tag>Tob15</b:Tag>
-    <b:SourceType>Misc</b:SourceType>
-    <b:Guid>{29FB4E03-D4E2-4E6C-BB77-3D25523F8481}</b:Guid>
-    <b:Author>
-      <b:Author>
-        <b:NameList>
-          <b:Person>
-            <b:Last>Fox</b:Last>
-            <b:First>Toby</b:First>
-          </b:Person>
-        </b:NameList>
-      </b:Author>
-    </b:Author>
-    <b:Title>Undertale</b:Title>
-    <b:Year>2015</b:Year>
-    <b:Month>September</b:Month>
-    <b:Day>15</b:Day>
-    <b:Publisher>Toby Fox</b:Publisher>
-    <b:RefOrder>2</b:RefOrder>
-  </b:Source>
-  <b:Source>
-    <b:Tag>Cel18</b:Tag>
-    <b:SourceType>Misc</b:SourceType>
-    <b:Guid>{B960E404-E381-4684-ADCC-03ED44C0627A}</b:Guid>
-    <b:Title>Celeste</b:Title>
-    <b:Year>2018</b:Year>
-    <b:Month>January</b:Month>
-    <b:Day>25</b:Day>
-    <b:Publisher>Maddy Makes Games</b:Publisher>
-    <b:RefOrder>3</b:RefOrder>
-  </b:Source>
-  <b:Source>
-    <b:Tag>Hol17</b:Tag>
-    <b:SourceType>Misc</b:SourceType>
-    <b:Guid>{0632AB41-DBD0-4867-8660-CA772F81E1B5}</b:Guid>
-    <b:Title>Hollow Knight</b:Title>
-    <b:Year>2017</b:Year>
-    <b:Month>February</b:Month>
-    <b:Day>24</b:Day>
-    <b:Publisher>Team Cherry</b:Publisher>
-    <b:RefOrder>4</b:RefOrder>
-  </b:Source>
-  <b:Source>
-    <b:Tag>Det18</b:Tag>
-    <b:SourceType>Misc</b:SourceType>
-    <b:Guid>{0BDE9AB6-86FF-4D02-A840-BBC835C8CA15}</b:Guid>
-    <b:Title>Detroit: Become Human</b:Title>
-    <b:Year>2018</b:Year>
-    <b:Month>May</b:Month>
-    <b:Day>25</b:Day>
-    <b:Publisher>Quantic Dream</b:Publisher>
-    <b:RefOrder>5</b:RefOrder>
-  </b:Source>
-  <b:Source>
-    <b:Tag>Mot17</b:Tag>
-    <b:SourceType>InternetSite</b:SourceType>
-    <b:Guid>{A972DF1B-15AE-4917-90EB-435287BDA62C}</b:Guid>
-    <b:Title>Dead Cells</b:Title>
-    <b:Year>2017</b:Year>
-    <b:Author>
-      <b:Author>
-        <b:Corporate>Motion Twin</b:Corporate>
-      </b:Author>
-    </b:Author>
-    <b:InternetSiteTitle>Steam</b:InternetSiteTitle>
-    <b:URL>https://store.steampowered.com/app/588650/Dead_Cells/</b:URL>
-    <b:RefOrder>6</b:RefOrder>
-  </b:Source>
-  <b:Source>
-    <b:Tag>TobSteam</b:Tag>
-    <b:SourceType>InternetSite</b:SourceType>
-    <b:Guid>{404E800E-3E08-4ADF-8B4C-83FD2F40553F}</b:Guid>
-    <b:Author>
-      <b:Author>
-        <b:Corporate>Toby Fox</b:Corporate>
-      </b:Author>
-    </b:Author>
-    <b:Title>Undertale store page</b:Title>
-    <b:InternetSiteTitle>Steam</b:InternetSiteTitle>
-    <b:Year>2015</b:Year>
-    <b:URL>https://store.steampowered.com/app/391540/Undertale/</b:URL>
-    <b:RefOrder>7</b:RefOrder>
-  </b:Source>
-  <b:Source>
-    <b:Tag>Und26</b:Tag>
-    <b:SourceType>InternetSite</b:SourceType>
-    <b:Guid>{B80DD092-5A2C-4533-A74B-DD888F53D236}</b:Guid>
-    <b:Title>Attack Types - Undertale Wiki</b:Title>
-    <b:Year>2026</b:Year>
-    <b:Author>
-      <b:Author>
-        <b:Corporate>Undertale Wiki</b:Corporate>
-      </b:Author>
-    </b:Author>
-    <b:InternetSiteTitle>Fandom</b:InternetSiteTitle>
-    <b:URL>https://undertale.fandom.com/wiki/Attack_Types#White_Attack</b:URL>
-    <b:RefOrder>8</b:RefOrder>
-  </b:Source>
-  <b:Source>
-    <b:Tag>Und</b:Tag>
-    <b:SourceType>InternetSite</b:SourceType>
-    <b:Guid>{D6A4FC71-2C51-4F66-B13F-320F1581140C}</b:Guid>
-    <b:Author>
-      <b:Author>
-        <b:Corporate>Undertale Wiki</b:Corporate>
-      </b:Author>
-    </b:Author>
-    <b:Title>SOUL Modes - Undertale Wiki</b:Title>
-    <b:InternetSiteTitle>Fandom</b:InternetSiteTitle>
-    <b:URL>https://undertale.fandom.com/wiki/SOUL_Modes#Red</b:URL>
-    <b:Year>2026</b:Year>
-    <b:RefOrder>9</b:RefOrder>
-  </b:Source>
-</b:Sources>
+<file path=customXml/item2.xml><?xml version="1.0" encoding="utf-8"?>
+<p:properties xmlns:p="http://schemas.microsoft.com/office/2006/metadata/properties" xmlns:xsi="http://www.w3.org/2001/XMLSchema-instance" xmlns:pc="http://schemas.microsoft.com/office/infopath/2007/PartnerControls">
+  <documentManagement>
+    <_activity xmlns="bf3b6886-11cb-4b34-846a-332f0895a374" xsi:nil="true"/>
+  </documentManagement>
+</p:properties>
 </file>
 
-<file path=customXml/item4.xml><?xml version="1.0" encoding="utf-8"?>
+<file path=customXml/item3.xml><?xml version="1.0" encoding="utf-8"?>
 <ct:contentTypeSchema xmlns:ct="http://schemas.microsoft.com/office/2006/metadata/contentType" xmlns:ma="http://schemas.microsoft.com/office/2006/metadata/properties/metaAttributes" ct:_="" ma:_="" ma:contentTypeName="Document" ma:contentTypeID="0x010100EC07FD61BB0A254FAE9C962FF8949AE3" ma:contentTypeVersion="10" ma:contentTypeDescription="Create a new document." ma:contentTypeScope="" ma:versionID="d17aaf8db75ea87a57b6dff2fa82118e">
   <xsd:schema xmlns:xsd="http://www.w3.org/2001/XMLSchema" xmlns:xs="http://www.w3.org/2001/XMLSchema" xmlns:p="http://schemas.microsoft.com/office/2006/metadata/properties" xmlns:ns3="bf3b6886-11cb-4b34-846a-332f0895a374" targetNamespace="http://schemas.microsoft.com/office/2006/metadata/properties" ma:root="true" ma:fieldsID="59a139080a436865d51ede40da921051" ns3:_="">
     <xsd:import namespace="bf3b6886-11cb-4b34-846a-332f0895a374"/>
@@ -8976,7 +9683,159 @@
 </ct:contentTypeSchema>
 </file>
 
+<file path=customXml/item4.xml><?xml version="1.0" encoding="utf-8"?>
+<b:Sources xmlns:b="http://schemas.openxmlformats.org/officeDocument/2006/bibliography" xmlns="http://schemas.openxmlformats.org/officeDocument/2006/bibliography" SelectedStyle="\APASixthEditionOfficeOnline.xsl" StyleName="APA" Version="6">
+  <b:Source>
+    <b:Tag>Dea17</b:Tag>
+    <b:SourceType>Misc</b:SourceType>
+    <b:Guid>{3C6C118D-AEE6-44A9-AAEC-7FFCD6D9849B}</b:Guid>
+    <b:Title>Dead Cells</b:Title>
+    <b:Year>2017</b:Year>
+    <b:Publisher>Motion Twin</b:Publisher>
+    <b:Month>May</b:Month>
+    <b:Day>10</b:Day>
+    <b:RefOrder>1</b:RefOrder>
+  </b:Source>
+  <b:Source>
+    <b:Tag>Tob15</b:Tag>
+    <b:SourceType>Misc</b:SourceType>
+    <b:Guid>{29FB4E03-D4E2-4E6C-BB77-3D25523F8481}</b:Guid>
+    <b:Author>
+      <b:Author>
+        <b:NameList>
+          <b:Person>
+            <b:Last>Fox</b:Last>
+            <b:First>Toby</b:First>
+          </b:Person>
+        </b:NameList>
+      </b:Author>
+    </b:Author>
+    <b:Title>Undertale</b:Title>
+    <b:Year>2015</b:Year>
+    <b:Month>September</b:Month>
+    <b:Day>15</b:Day>
+    <b:Publisher>Toby Fox</b:Publisher>
+    <b:RefOrder>2</b:RefOrder>
+  </b:Source>
+  <b:Source>
+    <b:Tag>Cel18</b:Tag>
+    <b:SourceType>Misc</b:SourceType>
+    <b:Guid>{B960E404-E381-4684-ADCC-03ED44C0627A}</b:Guid>
+    <b:Title>Celeste</b:Title>
+    <b:Year>2018</b:Year>
+    <b:Month>January</b:Month>
+    <b:Day>25</b:Day>
+    <b:Publisher>Maddy Makes Games</b:Publisher>
+    <b:RefOrder>3</b:RefOrder>
+  </b:Source>
+  <b:Source>
+    <b:Tag>Hol17</b:Tag>
+    <b:SourceType>Misc</b:SourceType>
+    <b:Guid>{0632AB41-DBD0-4867-8660-CA772F81E1B5}</b:Guid>
+    <b:Title>Hollow Knight</b:Title>
+    <b:Year>2017</b:Year>
+    <b:Month>February</b:Month>
+    <b:Day>24</b:Day>
+    <b:Publisher>Team Cherry</b:Publisher>
+    <b:RefOrder>4</b:RefOrder>
+  </b:Source>
+  <b:Source>
+    <b:Tag>Det18</b:Tag>
+    <b:SourceType>Misc</b:SourceType>
+    <b:Guid>{0BDE9AB6-86FF-4D02-A840-BBC835C8CA15}</b:Guid>
+    <b:Title>Detroit: Become Human</b:Title>
+    <b:Year>2018</b:Year>
+    <b:Month>May</b:Month>
+    <b:Day>25</b:Day>
+    <b:Publisher>Quantic Dream</b:Publisher>
+    <b:RefOrder>5</b:RefOrder>
+  </b:Source>
+  <b:Source>
+    <b:Tag>Mot17</b:Tag>
+    <b:SourceType>InternetSite</b:SourceType>
+    <b:Guid>{A972DF1B-15AE-4917-90EB-435287BDA62C}</b:Guid>
+    <b:Title>Dead Cells</b:Title>
+    <b:Year>2017</b:Year>
+    <b:Author>
+      <b:Author>
+        <b:Corporate>Motion Twin</b:Corporate>
+      </b:Author>
+    </b:Author>
+    <b:InternetSiteTitle>Steam</b:InternetSiteTitle>
+    <b:URL>https://store.steampowered.com/app/588650/Dead_Cells/</b:URL>
+    <b:RefOrder>6</b:RefOrder>
+  </b:Source>
+  <b:Source>
+    <b:Tag>TobSteam</b:Tag>
+    <b:SourceType>InternetSite</b:SourceType>
+    <b:Guid>{404E800E-3E08-4ADF-8B4C-83FD2F40553F}</b:Guid>
+    <b:Author>
+      <b:Author>
+        <b:Corporate>Toby Fox</b:Corporate>
+      </b:Author>
+    </b:Author>
+    <b:Title>Undertale store page</b:Title>
+    <b:InternetSiteTitle>Steam</b:InternetSiteTitle>
+    <b:Year>2015</b:Year>
+    <b:URL>https://store.steampowered.com/app/391540/Undertale/</b:URL>
+    <b:RefOrder>7</b:RefOrder>
+  </b:Source>
+  <b:Source>
+    <b:Tag>Und26</b:Tag>
+    <b:SourceType>InternetSite</b:SourceType>
+    <b:Guid>{B80DD092-5A2C-4533-A74B-DD888F53D236}</b:Guid>
+    <b:Title>Attack Types - Undertale Wiki</b:Title>
+    <b:Year>2026</b:Year>
+    <b:Author>
+      <b:Author>
+        <b:Corporate>Undertale Wiki</b:Corporate>
+      </b:Author>
+    </b:Author>
+    <b:InternetSiteTitle>Fandom</b:InternetSiteTitle>
+    <b:URL>https://undertale.fandom.com/wiki/Attack_Types#White_Attack</b:URL>
+    <b:RefOrder>8</b:RefOrder>
+  </b:Source>
+  <b:Source>
+    <b:Tag>Und</b:Tag>
+    <b:SourceType>InternetSite</b:SourceType>
+    <b:Guid>{D6A4FC71-2C51-4F66-B13F-320F1581140C}</b:Guid>
+    <b:Author>
+      <b:Author>
+        <b:Corporate>Undertale Wiki</b:Corporate>
+      </b:Author>
+    </b:Author>
+    <b:Title>SOUL Modes - Undertale Wiki</b:Title>
+    <b:InternetSiteTitle>Fandom</b:InternetSiteTitle>
+    <b:URL>https://undertale.fandom.com/wiki/SOUL_Modes#Red</b:URL>
+    <b:Year>2026</b:Year>
+    <b:RefOrder>9</b:RefOrder>
+  </b:Source>
+  <b:Source>
+    <b:Tag>Tar</b:Tag>
+    <b:SourceType>InternetSite</b:SourceType>
+    <b:Guid>{008D40ED-CCB5-41DD-B539-6D4103D03489}</b:Guid>
+    <b:Author>
+      <b:Author>
+        <b:Corporate>Tarovent</b:Corporate>
+      </b:Author>
+    </b:Author>
+    <b:Title>Major Arcana Meanings</b:Title>
+    <b:InternetSiteTitle>Tarovent</b:InternetSiteTitle>
+    <b:URL>https://www.tarovent.com/major-arcana-meanings</b:URL>
+    <b:RefOrder>10</b:RefOrder>
+  </b:Source>
+</b:Sources>
+</file>
+
 <file path=customXml/itemProps1.xml><?xml version="1.0" encoding="utf-8"?>
+<ds:datastoreItem xmlns:ds="http://schemas.openxmlformats.org/officeDocument/2006/customXml" ds:itemID="{C4A301BA-2DFB-4B71-BF59-F05F9A9654D3}">
+  <ds:schemaRefs>
+    <ds:schemaRef ds:uri="http://schemas.microsoft.com/sharepoint/v3/contenttype/forms"/>
+  </ds:schemaRefs>
+</ds:datastoreItem>
+</file>
+
+<file path=customXml/itemProps2.xml><?xml version="1.0" encoding="utf-8"?>
 <ds:datastoreItem xmlns:ds="http://schemas.openxmlformats.org/officeDocument/2006/customXml" ds:itemID="{600D15C5-8D6F-48BE-8655-F9550CE2F632}">
   <ds:schemaRefs>
     <ds:schemaRef ds:uri="http://schemas.microsoft.com/office/2006/metadata/properties"/>
@@ -8986,23 +9845,7 @@
 </ds:datastoreItem>
 </file>
 
-<file path=customXml/itemProps2.xml><?xml version="1.0" encoding="utf-8"?>
-<ds:datastoreItem xmlns:ds="http://schemas.openxmlformats.org/officeDocument/2006/customXml" ds:itemID="{C4A301BA-2DFB-4B71-BF59-F05F9A9654D3}">
-  <ds:schemaRefs>
-    <ds:schemaRef ds:uri="http://schemas.microsoft.com/sharepoint/v3/contenttype/forms"/>
-  </ds:schemaRefs>
-</ds:datastoreItem>
-</file>
-
 <file path=customXml/itemProps3.xml><?xml version="1.0" encoding="utf-8"?>
-<ds:datastoreItem xmlns:ds="http://schemas.openxmlformats.org/officeDocument/2006/customXml" ds:itemID="{C9B48BB0-0B22-40A2-8017-611713517981}">
-  <ds:schemaRefs>
-    <ds:schemaRef ds:uri="http://schemas.openxmlformats.org/officeDocument/2006/bibliography"/>
-  </ds:schemaRefs>
-</ds:datastoreItem>
-</file>
-
-<file path=customXml/itemProps4.xml><?xml version="1.0" encoding="utf-8"?>
 <ds:datastoreItem xmlns:ds="http://schemas.openxmlformats.org/officeDocument/2006/customXml" ds:itemID="{A0E16D8C-A8BB-406F-8480-50FE1CEFEC9A}">
   <ds:schemaRefs>
     <ds:schemaRef ds:uri="http://schemas.microsoft.com/office/2006/metadata/contentType"/>
@@ -9018,4 +9861,12 @@
     <ds:schemaRef ds:uri="http://schemas.microsoft.com/internal/obd"/>
   </ds:schemaRefs>
 </ds:datastoreItem>
+</file>
+
+<file path=customXml/itemProps4.xml><?xml version="1.0" encoding="utf-8"?>
+<ds:datastoreItem xmlns:ds="http://schemas.openxmlformats.org/officeDocument/2006/customXml" ds:itemID="{ECB6D473-4D96-4F61-9FB1-FAD6DBB09ACC}">
+  <ds:schemaRefs>
+    <ds:schemaRef ds:uri="http://schemas.openxmlformats.org/officeDocument/2006/bibliography"/>
+  </ds:schemaRefs>
+</ds:datastoreItem>
 </file>
</xml_diff>